<commit_message>
docs(report): align the confirmed member identity in Word and PDF
</commit_message>
<xml_diff>
--- a/report/NhomXX_CafeLink_Report_Current_20261030.docx
+++ b/report/NhomXX_CafeLink_Report_Current_20261030.docx
@@ -516,13 +516,12 @@
         <w:tabs>
           <w:tab w:val="right" w:leader="dot" w:pos="8778"/>
         </w:tabs>
-        <w:spacing w:after="0" w:line="240" w:lineRule="auto"/>
         <w:rPr>
-          <w:rFonts w:eastAsiaTheme="minorEastAsia"/>
+          <w:rFonts w:asciiTheme="minorHAnsi" w:eastAsiaTheme="minorEastAsia" w:hAnsiTheme="minorHAnsi" w:cstheme="minorBidi"/>
           <w:noProof/>
           <w:color w:val="auto"/>
           <w:kern w:val="2"/>
-          <w:sz w:val="22"/>
+          <w:sz w:val="24"/>
           <w:szCs w:val="24"/>
           <w14:ligatures w14:val="standardContextual"/>
         </w:rPr>
@@ -545,12 +544,11 @@
         </w:rPr>
         <w:fldChar w:fldCharType="separate"/>
       </w:r>
-      <w:hyperlink w:anchor="_Toc244296984" w:history="1">
+      <w:hyperlink w:anchor="_Toc244297408" w:history="1">
         <w:r>
           <w:rPr>
             <w:rStyle w:val="Hyperlink"/>
             <w:noProof/>
-            <w:sz w:val="22"/>
           </w:rPr>
           <w:t>TÓM TẮT - ABSTRACT</w:t>
         </w:r>
@@ -558,7 +556,6 @@
           <w:rPr>
             <w:noProof/>
             <w:webHidden/>
-            <w:sz w:val="22"/>
           </w:rPr>
           <w:tab/>
         </w:r>
@@ -566,7 +563,6 @@
           <w:rPr>
             <w:noProof/>
             <w:webHidden/>
-            <w:sz w:val="22"/>
           </w:rPr>
           <w:fldChar w:fldCharType="begin"/>
         </w:r>
@@ -574,22 +570,19 @@
           <w:rPr>
             <w:noProof/>
             <w:webHidden/>
-            <w:sz w:val="22"/>
-          </w:rPr>
-          <w:instrText xml:space="preserve"> PAGEREF _Toc244296984 \h </w:instrText>
-        </w:r>
-        <w:r>
-          <w:rPr>
-            <w:noProof/>
-            <w:webHidden/>
-            <w:sz w:val="22"/>
-          </w:rPr>
-        </w:r>
-        <w:r>
-          <w:rPr>
-            <w:noProof/>
-            <w:webHidden/>
-            <w:sz w:val="22"/>
+          </w:rPr>
+          <w:instrText xml:space="preserve"> PAGEREF _Toc244297408 \h </w:instrText>
+        </w:r>
+        <w:r>
+          <w:rPr>
+            <w:noProof/>
+            <w:webHidden/>
+          </w:rPr>
+        </w:r>
+        <w:r>
+          <w:rPr>
+            <w:noProof/>
+            <w:webHidden/>
           </w:rPr>
           <w:fldChar w:fldCharType="separate"/>
         </w:r>
@@ -597,15 +590,13 @@
           <w:rPr>
             <w:noProof/>
             <w:webHidden/>
-            <w:sz w:val="22"/>
-          </w:rPr>
-          <w:t>iv</w:t>
-        </w:r>
-        <w:r>
-          <w:rPr>
-            <w:noProof/>
-            <w:webHidden/>
-            <w:sz w:val="22"/>
+          </w:rPr>
+          <w:t>v</w:t>
+        </w:r>
+        <w:r>
+          <w:rPr>
+            <w:noProof/>
+            <w:webHidden/>
           </w:rPr>
           <w:fldChar w:fldCharType="end"/>
         </w:r>
@@ -617,23 +608,21 @@
         <w:tabs>
           <w:tab w:val="right" w:leader="dot" w:pos="8778"/>
         </w:tabs>
-        <w:spacing w:after="0" w:line="240" w:lineRule="auto"/>
         <w:rPr>
-          <w:rFonts w:eastAsiaTheme="minorEastAsia"/>
+          <w:rFonts w:asciiTheme="minorHAnsi" w:eastAsiaTheme="minorEastAsia" w:hAnsiTheme="minorHAnsi" w:cstheme="minorBidi"/>
           <w:noProof/>
           <w:color w:val="auto"/>
           <w:kern w:val="2"/>
-          <w:sz w:val="22"/>
+          <w:sz w:val="24"/>
           <w:szCs w:val="24"/>
           <w14:ligatures w14:val="standardContextual"/>
         </w:rPr>
       </w:pPr>
-      <w:hyperlink w:anchor="_Toc244296985" w:history="1">
+      <w:hyperlink w:anchor="_Toc244297409" w:history="1">
         <w:r>
           <w:rPr>
             <w:rStyle w:val="Hyperlink"/>
             <w:noProof/>
-            <w:sz w:val="22"/>
           </w:rPr>
           <w:t>1. GIỚI THIỆU</w:t>
         </w:r>
@@ -641,7 +630,6 @@
           <w:rPr>
             <w:noProof/>
             <w:webHidden/>
-            <w:sz w:val="22"/>
           </w:rPr>
           <w:tab/>
         </w:r>
@@ -649,7 +637,6 @@
           <w:rPr>
             <w:noProof/>
             <w:webHidden/>
-            <w:sz w:val="22"/>
           </w:rPr>
           <w:fldChar w:fldCharType="begin"/>
         </w:r>
@@ -657,22 +644,19 @@
           <w:rPr>
             <w:noProof/>
             <w:webHidden/>
-            <w:sz w:val="22"/>
-          </w:rPr>
-          <w:instrText xml:space="preserve"> PAGEREF _Toc244296985 \h </w:instrText>
-        </w:r>
-        <w:r>
-          <w:rPr>
-            <w:noProof/>
-            <w:webHidden/>
-            <w:sz w:val="22"/>
-          </w:rPr>
-        </w:r>
-        <w:r>
-          <w:rPr>
-            <w:noProof/>
-            <w:webHidden/>
-            <w:sz w:val="22"/>
+          </w:rPr>
+          <w:instrText xml:space="preserve"> PAGEREF _Toc244297409 \h </w:instrText>
+        </w:r>
+        <w:r>
+          <w:rPr>
+            <w:noProof/>
+            <w:webHidden/>
+          </w:rPr>
+        </w:r>
+        <w:r>
+          <w:rPr>
+            <w:noProof/>
+            <w:webHidden/>
           </w:rPr>
           <w:fldChar w:fldCharType="separate"/>
         </w:r>
@@ -680,7 +664,6 @@
           <w:rPr>
             <w:noProof/>
             <w:webHidden/>
-            <w:sz w:val="22"/>
           </w:rPr>
           <w:t>1</w:t>
         </w:r>
@@ -688,7 +671,6 @@
           <w:rPr>
             <w:noProof/>
             <w:webHidden/>
-            <w:sz w:val="22"/>
           </w:rPr>
           <w:fldChar w:fldCharType="end"/>
         </w:r>
@@ -700,23 +682,21 @@
         <w:tabs>
           <w:tab w:val="right" w:leader="dot" w:pos="8778"/>
         </w:tabs>
-        <w:spacing w:after="0" w:line="240" w:lineRule="auto"/>
         <w:rPr>
-          <w:rFonts w:eastAsiaTheme="minorEastAsia"/>
+          <w:rFonts w:asciiTheme="minorHAnsi" w:eastAsiaTheme="minorEastAsia" w:hAnsiTheme="minorHAnsi" w:cstheme="minorBidi"/>
           <w:noProof/>
           <w:color w:val="auto"/>
           <w:kern w:val="2"/>
-          <w:sz w:val="22"/>
+          <w:sz w:val="24"/>
           <w:szCs w:val="24"/>
           <w14:ligatures w14:val="standardContextual"/>
         </w:rPr>
       </w:pPr>
-      <w:hyperlink w:anchor="_Toc244296986" w:history="1">
+      <w:hyperlink w:anchor="_Toc244297410" w:history="1">
         <w:r>
           <w:rPr>
             <w:rStyle w:val="Hyperlink"/>
             <w:noProof/>
-            <w:sz w:val="22"/>
           </w:rPr>
           <w:t>2. KIẾN THỨC NỀN VÀ CÔNG TRÌNH LIÊN QUAN</w:t>
         </w:r>
@@ -724,7 +704,6 @@
           <w:rPr>
             <w:noProof/>
             <w:webHidden/>
-            <w:sz w:val="22"/>
           </w:rPr>
           <w:tab/>
         </w:r>
@@ -732,7 +711,6 @@
           <w:rPr>
             <w:noProof/>
             <w:webHidden/>
-            <w:sz w:val="22"/>
           </w:rPr>
           <w:fldChar w:fldCharType="begin"/>
         </w:r>
@@ -740,22 +718,19 @@
           <w:rPr>
             <w:noProof/>
             <w:webHidden/>
-            <w:sz w:val="22"/>
-          </w:rPr>
-          <w:instrText xml:space="preserve"> PAGEREF _Toc244296986 \h </w:instrText>
-        </w:r>
-        <w:r>
-          <w:rPr>
-            <w:noProof/>
-            <w:webHidden/>
-            <w:sz w:val="22"/>
-          </w:rPr>
-        </w:r>
-        <w:r>
-          <w:rPr>
-            <w:noProof/>
-            <w:webHidden/>
-            <w:sz w:val="22"/>
+          </w:rPr>
+          <w:instrText xml:space="preserve"> PAGEREF _Toc244297410 \h </w:instrText>
+        </w:r>
+        <w:r>
+          <w:rPr>
+            <w:noProof/>
+            <w:webHidden/>
+          </w:rPr>
+        </w:r>
+        <w:r>
+          <w:rPr>
+            <w:noProof/>
+            <w:webHidden/>
           </w:rPr>
           <w:fldChar w:fldCharType="separate"/>
         </w:r>
@@ -763,7 +738,6 @@
           <w:rPr>
             <w:noProof/>
             <w:webHidden/>
-            <w:sz w:val="22"/>
           </w:rPr>
           <w:t>2</w:t>
         </w:r>
@@ -771,7 +745,6 @@
           <w:rPr>
             <w:noProof/>
             <w:webHidden/>
-            <w:sz w:val="22"/>
           </w:rPr>
           <w:fldChar w:fldCharType="end"/>
         </w:r>
@@ -783,23 +756,21 @@
         <w:tabs>
           <w:tab w:val="right" w:leader="dot" w:pos="8778"/>
         </w:tabs>
-        <w:spacing w:after="0" w:line="240" w:lineRule="auto"/>
         <w:rPr>
-          <w:rFonts w:eastAsiaTheme="minorEastAsia"/>
+          <w:rFonts w:asciiTheme="minorHAnsi" w:eastAsiaTheme="minorEastAsia" w:hAnsiTheme="minorHAnsi" w:cstheme="minorBidi"/>
           <w:noProof/>
           <w:color w:val="auto"/>
           <w:kern w:val="2"/>
-          <w:sz w:val="22"/>
+          <w:sz w:val="24"/>
           <w:szCs w:val="24"/>
           <w14:ligatures w14:val="standardContextual"/>
         </w:rPr>
       </w:pPr>
-      <w:hyperlink w:anchor="_Toc244296987" w:history="1">
+      <w:hyperlink w:anchor="_Toc244297411" w:history="1">
         <w:r>
           <w:rPr>
             <w:rStyle w:val="Hyperlink"/>
             <w:noProof/>
-            <w:sz w:val="22"/>
           </w:rPr>
           <w:t>3. ĐỊNH NGHĨA BÀI TOÁN</w:t>
         </w:r>
@@ -807,7 +778,6 @@
           <w:rPr>
             <w:noProof/>
             <w:webHidden/>
-            <w:sz w:val="22"/>
           </w:rPr>
           <w:tab/>
         </w:r>
@@ -815,7 +785,6 @@
           <w:rPr>
             <w:noProof/>
             <w:webHidden/>
-            <w:sz w:val="22"/>
           </w:rPr>
           <w:fldChar w:fldCharType="begin"/>
         </w:r>
@@ -823,22 +792,19 @@
           <w:rPr>
             <w:noProof/>
             <w:webHidden/>
-            <w:sz w:val="22"/>
-          </w:rPr>
-          <w:instrText xml:space="preserve"> PAGEREF _Toc244296987 \h </w:instrText>
-        </w:r>
-        <w:r>
-          <w:rPr>
-            <w:noProof/>
-            <w:webHidden/>
-            <w:sz w:val="22"/>
-          </w:rPr>
-        </w:r>
-        <w:r>
-          <w:rPr>
-            <w:noProof/>
-            <w:webHidden/>
-            <w:sz w:val="22"/>
+          </w:rPr>
+          <w:instrText xml:space="preserve"> PAGEREF _Toc244297411 \h </w:instrText>
+        </w:r>
+        <w:r>
+          <w:rPr>
+            <w:noProof/>
+            <w:webHidden/>
+          </w:rPr>
+        </w:r>
+        <w:r>
+          <w:rPr>
+            <w:noProof/>
+            <w:webHidden/>
           </w:rPr>
           <w:fldChar w:fldCharType="separate"/>
         </w:r>
@@ -846,7 +812,6 @@
           <w:rPr>
             <w:noProof/>
             <w:webHidden/>
-            <w:sz w:val="22"/>
           </w:rPr>
           <w:t>3</w:t>
         </w:r>
@@ -854,7 +819,6 @@
           <w:rPr>
             <w:noProof/>
             <w:webHidden/>
-            <w:sz w:val="22"/>
           </w:rPr>
           <w:fldChar w:fldCharType="end"/>
         </w:r>
@@ -866,23 +830,21 @@
         <w:tabs>
           <w:tab w:val="right" w:leader="dot" w:pos="8778"/>
         </w:tabs>
-        <w:spacing w:after="0" w:line="240" w:lineRule="auto"/>
         <w:rPr>
-          <w:rFonts w:eastAsiaTheme="minorEastAsia"/>
+          <w:rFonts w:asciiTheme="minorHAnsi" w:eastAsiaTheme="minorEastAsia" w:hAnsiTheme="minorHAnsi" w:cstheme="minorBidi"/>
           <w:noProof/>
           <w:color w:val="auto"/>
           <w:kern w:val="2"/>
-          <w:sz w:val="22"/>
+          <w:sz w:val="24"/>
           <w:szCs w:val="24"/>
           <w14:ligatures w14:val="standardContextual"/>
         </w:rPr>
       </w:pPr>
-      <w:hyperlink w:anchor="_Toc244296988" w:history="1">
+      <w:hyperlink w:anchor="_Toc244297412" w:history="1">
         <w:r>
           <w:rPr>
             <w:rStyle w:val="Hyperlink"/>
             <w:noProof/>
-            <w:sz w:val="22"/>
           </w:rPr>
           <w:t>3.1. Người dùng và phạm vi hệ thống</w:t>
         </w:r>
@@ -890,7 +852,6 @@
           <w:rPr>
             <w:noProof/>
             <w:webHidden/>
-            <w:sz w:val="22"/>
           </w:rPr>
           <w:tab/>
         </w:r>
@@ -898,7 +859,6 @@
           <w:rPr>
             <w:noProof/>
             <w:webHidden/>
-            <w:sz w:val="22"/>
           </w:rPr>
           <w:fldChar w:fldCharType="begin"/>
         </w:r>
@@ -906,22 +866,19 @@
           <w:rPr>
             <w:noProof/>
             <w:webHidden/>
-            <w:sz w:val="22"/>
-          </w:rPr>
-          <w:instrText xml:space="preserve"> PAGEREF _Toc244296988 \h </w:instrText>
-        </w:r>
-        <w:r>
-          <w:rPr>
-            <w:noProof/>
-            <w:webHidden/>
-            <w:sz w:val="22"/>
-          </w:rPr>
-        </w:r>
-        <w:r>
-          <w:rPr>
-            <w:noProof/>
-            <w:webHidden/>
-            <w:sz w:val="22"/>
+          </w:rPr>
+          <w:instrText xml:space="preserve"> PAGEREF _Toc244297412 \h </w:instrText>
+        </w:r>
+        <w:r>
+          <w:rPr>
+            <w:noProof/>
+            <w:webHidden/>
+          </w:rPr>
+        </w:r>
+        <w:r>
+          <w:rPr>
+            <w:noProof/>
+            <w:webHidden/>
           </w:rPr>
           <w:fldChar w:fldCharType="separate"/>
         </w:r>
@@ -929,7 +886,6 @@
           <w:rPr>
             <w:noProof/>
             <w:webHidden/>
-            <w:sz w:val="22"/>
           </w:rPr>
           <w:t>3</w:t>
         </w:r>
@@ -937,7 +893,6 @@
           <w:rPr>
             <w:noProof/>
             <w:webHidden/>
-            <w:sz w:val="22"/>
           </w:rPr>
           <w:fldChar w:fldCharType="end"/>
         </w:r>
@@ -949,23 +904,21 @@
         <w:tabs>
           <w:tab w:val="right" w:leader="dot" w:pos="8778"/>
         </w:tabs>
-        <w:spacing w:after="0" w:line="240" w:lineRule="auto"/>
         <w:rPr>
-          <w:rFonts w:eastAsiaTheme="minorEastAsia"/>
+          <w:rFonts w:asciiTheme="minorHAnsi" w:eastAsiaTheme="minorEastAsia" w:hAnsiTheme="minorHAnsi" w:cstheme="minorBidi"/>
           <w:noProof/>
           <w:color w:val="auto"/>
           <w:kern w:val="2"/>
-          <w:sz w:val="22"/>
+          <w:sz w:val="24"/>
           <w:szCs w:val="24"/>
           <w14:ligatures w14:val="standardContextual"/>
         </w:rPr>
       </w:pPr>
-      <w:hyperlink w:anchor="_Toc244296989" w:history="1">
+      <w:hyperlink w:anchor="_Toc244297413" w:history="1">
         <w:r>
           <w:rPr>
             <w:rStyle w:val="Hyperlink"/>
             <w:noProof/>
-            <w:sz w:val="22"/>
           </w:rPr>
           <w:t>3.2. Luồng nghiệp vụ chính</w:t>
         </w:r>
@@ -973,7 +926,6 @@
           <w:rPr>
             <w:noProof/>
             <w:webHidden/>
-            <w:sz w:val="22"/>
           </w:rPr>
           <w:tab/>
         </w:r>
@@ -981,7 +933,6 @@
           <w:rPr>
             <w:noProof/>
             <w:webHidden/>
-            <w:sz w:val="22"/>
           </w:rPr>
           <w:fldChar w:fldCharType="begin"/>
         </w:r>
@@ -989,22 +940,19 @@
           <w:rPr>
             <w:noProof/>
             <w:webHidden/>
-            <w:sz w:val="22"/>
-          </w:rPr>
-          <w:instrText xml:space="preserve"> PAGEREF _Toc244296989 \h </w:instrText>
-        </w:r>
-        <w:r>
-          <w:rPr>
-            <w:noProof/>
-            <w:webHidden/>
-            <w:sz w:val="22"/>
-          </w:rPr>
-        </w:r>
-        <w:r>
-          <w:rPr>
-            <w:noProof/>
-            <w:webHidden/>
-            <w:sz w:val="22"/>
+          </w:rPr>
+          <w:instrText xml:space="preserve"> PAGEREF _Toc244297413 \h </w:instrText>
+        </w:r>
+        <w:r>
+          <w:rPr>
+            <w:noProof/>
+            <w:webHidden/>
+          </w:rPr>
+        </w:r>
+        <w:r>
+          <w:rPr>
+            <w:noProof/>
+            <w:webHidden/>
           </w:rPr>
           <w:fldChar w:fldCharType="separate"/>
         </w:r>
@@ -1012,7 +960,6 @@
           <w:rPr>
             <w:noProof/>
             <w:webHidden/>
-            <w:sz w:val="22"/>
           </w:rPr>
           <w:t>3</w:t>
         </w:r>
@@ -1020,7 +967,6 @@
           <w:rPr>
             <w:noProof/>
             <w:webHidden/>
-            <w:sz w:val="22"/>
           </w:rPr>
           <w:fldChar w:fldCharType="end"/>
         </w:r>
@@ -1032,23 +978,21 @@
         <w:tabs>
           <w:tab w:val="right" w:leader="dot" w:pos="8778"/>
         </w:tabs>
-        <w:spacing w:after="0" w:line="240" w:lineRule="auto"/>
         <w:rPr>
-          <w:rFonts w:eastAsiaTheme="minorEastAsia"/>
+          <w:rFonts w:asciiTheme="minorHAnsi" w:eastAsiaTheme="minorEastAsia" w:hAnsiTheme="minorHAnsi" w:cstheme="minorBidi"/>
           <w:noProof/>
           <w:color w:val="auto"/>
           <w:kern w:val="2"/>
-          <w:sz w:val="22"/>
+          <w:sz w:val="24"/>
           <w:szCs w:val="24"/>
           <w14:ligatures w14:val="standardContextual"/>
         </w:rPr>
       </w:pPr>
-      <w:hyperlink w:anchor="_Toc244296990" w:history="1">
+      <w:hyperlink w:anchor="_Toc244297414" w:history="1">
         <w:r>
           <w:rPr>
             <w:rStyle w:val="Hyperlink"/>
             <w:noProof/>
-            <w:sz w:val="22"/>
           </w:rPr>
           <w:t>3.3. Điều kiện cần giữ đúng</w:t>
         </w:r>
@@ -1056,7 +1000,6 @@
           <w:rPr>
             <w:noProof/>
             <w:webHidden/>
-            <w:sz w:val="22"/>
           </w:rPr>
           <w:tab/>
         </w:r>
@@ -1064,7 +1007,6 @@
           <w:rPr>
             <w:noProof/>
             <w:webHidden/>
-            <w:sz w:val="22"/>
           </w:rPr>
           <w:fldChar w:fldCharType="begin"/>
         </w:r>
@@ -1072,22 +1014,19 @@
           <w:rPr>
             <w:noProof/>
             <w:webHidden/>
-            <w:sz w:val="22"/>
-          </w:rPr>
-          <w:instrText xml:space="preserve"> PAGEREF _Toc244296990 \h </w:instrText>
-        </w:r>
-        <w:r>
-          <w:rPr>
-            <w:noProof/>
-            <w:webHidden/>
-            <w:sz w:val="22"/>
-          </w:rPr>
-        </w:r>
-        <w:r>
-          <w:rPr>
-            <w:noProof/>
-            <w:webHidden/>
-            <w:sz w:val="22"/>
+          </w:rPr>
+          <w:instrText xml:space="preserve"> PAGEREF _Toc244297414 \h </w:instrText>
+        </w:r>
+        <w:r>
+          <w:rPr>
+            <w:noProof/>
+            <w:webHidden/>
+          </w:rPr>
+        </w:r>
+        <w:r>
+          <w:rPr>
+            <w:noProof/>
+            <w:webHidden/>
           </w:rPr>
           <w:fldChar w:fldCharType="separate"/>
         </w:r>
@@ -1095,7 +1034,6 @@
           <w:rPr>
             <w:noProof/>
             <w:webHidden/>
-            <w:sz w:val="22"/>
           </w:rPr>
           <w:t>4</w:t>
         </w:r>
@@ -1103,7 +1041,6 @@
           <w:rPr>
             <w:noProof/>
             <w:webHidden/>
-            <w:sz w:val="22"/>
           </w:rPr>
           <w:fldChar w:fldCharType="end"/>
         </w:r>
@@ -1115,23 +1052,21 @@
         <w:tabs>
           <w:tab w:val="right" w:leader="dot" w:pos="8778"/>
         </w:tabs>
-        <w:spacing w:after="0" w:line="240" w:lineRule="auto"/>
         <w:rPr>
-          <w:rFonts w:eastAsiaTheme="minorEastAsia"/>
+          <w:rFonts w:asciiTheme="minorHAnsi" w:eastAsiaTheme="minorEastAsia" w:hAnsiTheme="minorHAnsi" w:cstheme="minorBidi"/>
           <w:noProof/>
           <w:color w:val="auto"/>
           <w:kern w:val="2"/>
-          <w:sz w:val="22"/>
+          <w:sz w:val="24"/>
           <w:szCs w:val="24"/>
           <w14:ligatures w14:val="standardContextual"/>
         </w:rPr>
       </w:pPr>
-      <w:hyperlink w:anchor="_Toc244296991" w:history="1">
+      <w:hyperlink w:anchor="_Toc244297415" w:history="1">
         <w:r>
           <w:rPr>
             <w:rStyle w:val="Hyperlink"/>
             <w:noProof/>
-            <w:sz w:val="22"/>
           </w:rPr>
           <w:t>4. GIẢI PHÁP ĐỀ XUẤT</w:t>
         </w:r>
@@ -1139,7 +1074,6 @@
           <w:rPr>
             <w:noProof/>
             <w:webHidden/>
-            <w:sz w:val="22"/>
           </w:rPr>
           <w:tab/>
         </w:r>
@@ -1147,7 +1081,6 @@
           <w:rPr>
             <w:noProof/>
             <w:webHidden/>
-            <w:sz w:val="22"/>
           </w:rPr>
           <w:fldChar w:fldCharType="begin"/>
         </w:r>
@@ -1155,22 +1088,19 @@
           <w:rPr>
             <w:noProof/>
             <w:webHidden/>
-            <w:sz w:val="22"/>
-          </w:rPr>
-          <w:instrText xml:space="preserve"> PAGEREF _Toc244296991 \h </w:instrText>
-        </w:r>
-        <w:r>
-          <w:rPr>
-            <w:noProof/>
-            <w:webHidden/>
-            <w:sz w:val="22"/>
-          </w:rPr>
-        </w:r>
-        <w:r>
-          <w:rPr>
-            <w:noProof/>
-            <w:webHidden/>
-            <w:sz w:val="22"/>
+          </w:rPr>
+          <w:instrText xml:space="preserve"> PAGEREF _Toc244297415 \h </w:instrText>
+        </w:r>
+        <w:r>
+          <w:rPr>
+            <w:noProof/>
+            <w:webHidden/>
+          </w:rPr>
+        </w:r>
+        <w:r>
+          <w:rPr>
+            <w:noProof/>
+            <w:webHidden/>
           </w:rPr>
           <w:fldChar w:fldCharType="separate"/>
         </w:r>
@@ -1178,7 +1108,6 @@
           <w:rPr>
             <w:noProof/>
             <w:webHidden/>
-            <w:sz w:val="22"/>
           </w:rPr>
           <w:t>5</w:t>
         </w:r>
@@ -1186,7 +1115,6 @@
           <w:rPr>
             <w:noProof/>
             <w:webHidden/>
-            <w:sz w:val="22"/>
           </w:rPr>
           <w:fldChar w:fldCharType="end"/>
         </w:r>
@@ -1198,23 +1126,21 @@
         <w:tabs>
           <w:tab w:val="right" w:leader="dot" w:pos="8778"/>
         </w:tabs>
-        <w:spacing w:after="0" w:line="240" w:lineRule="auto"/>
         <w:rPr>
-          <w:rFonts w:eastAsiaTheme="minorEastAsia"/>
+          <w:rFonts w:asciiTheme="minorHAnsi" w:eastAsiaTheme="minorEastAsia" w:hAnsiTheme="minorHAnsi" w:cstheme="minorBidi"/>
           <w:noProof/>
           <w:color w:val="auto"/>
           <w:kern w:val="2"/>
-          <w:sz w:val="22"/>
+          <w:sz w:val="24"/>
           <w:szCs w:val="24"/>
           <w14:ligatures w14:val="standardContextual"/>
         </w:rPr>
       </w:pPr>
-      <w:hyperlink w:anchor="_Toc244296992" w:history="1">
+      <w:hyperlink w:anchor="_Toc244297416" w:history="1">
         <w:r>
           <w:rPr>
             <w:rStyle w:val="Hyperlink"/>
             <w:noProof/>
-            <w:sz w:val="22"/>
           </w:rPr>
           <w:t>4.1. Tổ chức luồng gọi món và điều phối</w:t>
         </w:r>
@@ -1222,7 +1148,6 @@
           <w:rPr>
             <w:noProof/>
             <w:webHidden/>
-            <w:sz w:val="22"/>
           </w:rPr>
           <w:tab/>
         </w:r>
@@ -1230,7 +1155,6 @@
           <w:rPr>
             <w:noProof/>
             <w:webHidden/>
-            <w:sz w:val="22"/>
           </w:rPr>
           <w:fldChar w:fldCharType="begin"/>
         </w:r>
@@ -1238,22 +1162,19 @@
           <w:rPr>
             <w:noProof/>
             <w:webHidden/>
-            <w:sz w:val="22"/>
-          </w:rPr>
-          <w:instrText xml:space="preserve"> PAGEREF _Toc244296992 \h </w:instrText>
-        </w:r>
-        <w:r>
-          <w:rPr>
-            <w:noProof/>
-            <w:webHidden/>
-            <w:sz w:val="22"/>
-          </w:rPr>
-        </w:r>
-        <w:r>
-          <w:rPr>
-            <w:noProof/>
-            <w:webHidden/>
-            <w:sz w:val="22"/>
+          </w:rPr>
+          <w:instrText xml:space="preserve"> PAGEREF _Toc244297416 \h </w:instrText>
+        </w:r>
+        <w:r>
+          <w:rPr>
+            <w:noProof/>
+            <w:webHidden/>
+          </w:rPr>
+        </w:r>
+        <w:r>
+          <w:rPr>
+            <w:noProof/>
+            <w:webHidden/>
           </w:rPr>
           <w:fldChar w:fldCharType="separate"/>
         </w:r>
@@ -1261,7 +1182,6 @@
           <w:rPr>
             <w:noProof/>
             <w:webHidden/>
-            <w:sz w:val="22"/>
           </w:rPr>
           <w:t>5</w:t>
         </w:r>
@@ -1269,7 +1189,6 @@
           <w:rPr>
             <w:noProof/>
             <w:webHidden/>
-            <w:sz w:val="22"/>
           </w:rPr>
           <w:fldChar w:fldCharType="end"/>
         </w:r>
@@ -1281,23 +1200,21 @@
         <w:tabs>
           <w:tab w:val="right" w:leader="dot" w:pos="8778"/>
         </w:tabs>
-        <w:spacing w:after="0" w:line="240" w:lineRule="auto"/>
         <w:rPr>
-          <w:rFonts w:eastAsiaTheme="minorEastAsia"/>
+          <w:rFonts w:asciiTheme="minorHAnsi" w:eastAsiaTheme="minorEastAsia" w:hAnsiTheme="minorHAnsi" w:cstheme="minorBidi"/>
           <w:noProof/>
           <w:color w:val="auto"/>
           <w:kern w:val="2"/>
-          <w:sz w:val="22"/>
+          <w:sz w:val="24"/>
           <w:szCs w:val="24"/>
           <w14:ligatures w14:val="standardContextual"/>
         </w:rPr>
       </w:pPr>
-      <w:hyperlink w:anchor="_Toc244296993" w:history="1">
+      <w:hyperlink w:anchor="_Toc244297417" w:history="1">
         <w:r>
           <w:rPr>
             <w:rStyle w:val="Hyperlink"/>
             <w:noProof/>
-            <w:sz w:val="22"/>
           </w:rPr>
           <w:t>4.2. Phục hồi theo loại yêu cầu</w:t>
         </w:r>
@@ -1305,7 +1222,6 @@
           <w:rPr>
             <w:noProof/>
             <w:webHidden/>
-            <w:sz w:val="22"/>
           </w:rPr>
           <w:tab/>
         </w:r>
@@ -1313,7 +1229,6 @@
           <w:rPr>
             <w:noProof/>
             <w:webHidden/>
-            <w:sz w:val="22"/>
           </w:rPr>
           <w:fldChar w:fldCharType="begin"/>
         </w:r>
@@ -1321,22 +1236,19 @@
           <w:rPr>
             <w:noProof/>
             <w:webHidden/>
-            <w:sz w:val="22"/>
-          </w:rPr>
-          <w:instrText xml:space="preserve"> PAGEREF _Toc244296993 \h </w:instrText>
-        </w:r>
-        <w:r>
-          <w:rPr>
-            <w:noProof/>
-            <w:webHidden/>
-            <w:sz w:val="22"/>
-          </w:rPr>
-        </w:r>
-        <w:r>
-          <w:rPr>
-            <w:noProof/>
-            <w:webHidden/>
-            <w:sz w:val="22"/>
+          </w:rPr>
+          <w:instrText xml:space="preserve"> PAGEREF _Toc244297417 \h </w:instrText>
+        </w:r>
+        <w:r>
+          <w:rPr>
+            <w:noProof/>
+            <w:webHidden/>
+          </w:rPr>
+        </w:r>
+        <w:r>
+          <w:rPr>
+            <w:noProof/>
+            <w:webHidden/>
           </w:rPr>
           <w:fldChar w:fldCharType="separate"/>
         </w:r>
@@ -1344,7 +1256,6 @@
           <w:rPr>
             <w:noProof/>
             <w:webHidden/>
-            <w:sz w:val="22"/>
           </w:rPr>
           <w:t>5</w:t>
         </w:r>
@@ -1352,7 +1263,6 @@
           <w:rPr>
             <w:noProof/>
             <w:webHidden/>
-            <w:sz w:val="22"/>
           </w:rPr>
           <w:fldChar w:fldCharType="end"/>
         </w:r>
@@ -1364,23 +1274,21 @@
         <w:tabs>
           <w:tab w:val="right" w:leader="dot" w:pos="8778"/>
         </w:tabs>
-        <w:spacing w:after="0" w:line="240" w:lineRule="auto"/>
         <w:rPr>
-          <w:rFonts w:eastAsiaTheme="minorEastAsia"/>
+          <w:rFonts w:asciiTheme="minorHAnsi" w:eastAsiaTheme="minorEastAsia" w:hAnsiTheme="minorHAnsi" w:cstheme="minorBidi"/>
           <w:noProof/>
           <w:color w:val="auto"/>
           <w:kern w:val="2"/>
-          <w:sz w:val="22"/>
+          <w:sz w:val="24"/>
           <w:szCs w:val="24"/>
           <w14:ligatures w14:val="standardContextual"/>
         </w:rPr>
       </w:pPr>
-      <w:hyperlink w:anchor="_Toc244296994" w:history="1">
+      <w:hyperlink w:anchor="_Toc244297418" w:history="1">
         <w:r>
           <w:rPr>
             <w:rStyle w:val="Hyperlink"/>
             <w:noProof/>
-            <w:sz w:val="22"/>
           </w:rPr>
           <w:t>4.3. Ghi nhớ quyết định bỏ và bảo vệ phiên</w:t>
         </w:r>
@@ -1388,7 +1296,6 @@
           <w:rPr>
             <w:noProof/>
             <w:webHidden/>
-            <w:sz w:val="22"/>
           </w:rPr>
           <w:tab/>
         </w:r>
@@ -1396,7 +1303,6 @@
           <w:rPr>
             <w:noProof/>
             <w:webHidden/>
-            <w:sz w:val="22"/>
           </w:rPr>
           <w:fldChar w:fldCharType="begin"/>
         </w:r>
@@ -1404,22 +1310,19 @@
           <w:rPr>
             <w:noProof/>
             <w:webHidden/>
-            <w:sz w:val="22"/>
-          </w:rPr>
-          <w:instrText xml:space="preserve"> PAGEREF _Toc244296994 \h </w:instrText>
-        </w:r>
-        <w:r>
-          <w:rPr>
-            <w:noProof/>
-            <w:webHidden/>
-            <w:sz w:val="22"/>
-          </w:rPr>
-        </w:r>
-        <w:r>
-          <w:rPr>
-            <w:noProof/>
-            <w:webHidden/>
-            <w:sz w:val="22"/>
+          </w:rPr>
+          <w:instrText xml:space="preserve"> PAGEREF _Toc244297418 \h </w:instrText>
+        </w:r>
+        <w:r>
+          <w:rPr>
+            <w:noProof/>
+            <w:webHidden/>
+          </w:rPr>
+        </w:r>
+        <w:r>
+          <w:rPr>
+            <w:noProof/>
+            <w:webHidden/>
           </w:rPr>
           <w:fldChar w:fldCharType="separate"/>
         </w:r>
@@ -1427,7 +1330,6 @@
           <w:rPr>
             <w:noProof/>
             <w:webHidden/>
-            <w:sz w:val="22"/>
           </w:rPr>
           <w:t>7</w:t>
         </w:r>
@@ -1435,7 +1337,6 @@
           <w:rPr>
             <w:noProof/>
             <w:webHidden/>
-            <w:sz w:val="22"/>
           </w:rPr>
           <w:fldChar w:fldCharType="end"/>
         </w:r>
@@ -1447,23 +1348,21 @@
         <w:tabs>
           <w:tab w:val="right" w:leader="dot" w:pos="8778"/>
         </w:tabs>
-        <w:spacing w:after="0" w:line="240" w:lineRule="auto"/>
         <w:rPr>
-          <w:rFonts w:eastAsiaTheme="minorEastAsia"/>
+          <w:rFonts w:asciiTheme="minorHAnsi" w:eastAsiaTheme="minorEastAsia" w:hAnsiTheme="minorHAnsi" w:cstheme="minorBidi"/>
           <w:noProof/>
           <w:color w:val="auto"/>
           <w:kern w:val="2"/>
-          <w:sz w:val="22"/>
+          <w:sz w:val="24"/>
           <w:szCs w:val="24"/>
           <w14:ligatures w14:val="standardContextual"/>
         </w:rPr>
       </w:pPr>
-      <w:hyperlink w:anchor="_Toc244296995" w:history="1">
+      <w:hyperlink w:anchor="_Toc244297419" w:history="1">
         <w:r>
           <w:rPr>
             <w:rStyle w:val="Hyperlink"/>
             <w:noProof/>
-            <w:sz w:val="22"/>
           </w:rPr>
           <w:t>5. KIẾN TRÚC HỆ THỐNG</w:t>
         </w:r>
@@ -1471,7 +1370,6 @@
           <w:rPr>
             <w:noProof/>
             <w:webHidden/>
-            <w:sz w:val="22"/>
           </w:rPr>
           <w:tab/>
         </w:r>
@@ -1479,7 +1377,6 @@
           <w:rPr>
             <w:noProof/>
             <w:webHidden/>
-            <w:sz w:val="22"/>
           </w:rPr>
           <w:fldChar w:fldCharType="begin"/>
         </w:r>
@@ -1487,22 +1384,19 @@
           <w:rPr>
             <w:noProof/>
             <w:webHidden/>
-            <w:sz w:val="22"/>
-          </w:rPr>
-          <w:instrText xml:space="preserve"> PAGEREF _Toc244296995 \h </w:instrText>
-        </w:r>
-        <w:r>
-          <w:rPr>
-            <w:noProof/>
-            <w:webHidden/>
-            <w:sz w:val="22"/>
-          </w:rPr>
-        </w:r>
-        <w:r>
-          <w:rPr>
-            <w:noProof/>
-            <w:webHidden/>
-            <w:sz w:val="22"/>
+          </w:rPr>
+          <w:instrText xml:space="preserve"> PAGEREF _Toc244297419 \h </w:instrText>
+        </w:r>
+        <w:r>
+          <w:rPr>
+            <w:noProof/>
+            <w:webHidden/>
+          </w:rPr>
+        </w:r>
+        <w:r>
+          <w:rPr>
+            <w:noProof/>
+            <w:webHidden/>
           </w:rPr>
           <w:fldChar w:fldCharType="separate"/>
         </w:r>
@@ -1510,7 +1404,6 @@
           <w:rPr>
             <w:noProof/>
             <w:webHidden/>
-            <w:sz w:val="22"/>
           </w:rPr>
           <w:t>8</w:t>
         </w:r>
@@ -1518,7 +1411,6 @@
           <w:rPr>
             <w:noProof/>
             <w:webHidden/>
-            <w:sz w:val="22"/>
           </w:rPr>
           <w:fldChar w:fldCharType="end"/>
         </w:r>
@@ -1530,23 +1422,21 @@
         <w:tabs>
           <w:tab w:val="right" w:leader="dot" w:pos="8778"/>
         </w:tabs>
-        <w:spacing w:after="0" w:line="240" w:lineRule="auto"/>
         <w:rPr>
-          <w:rFonts w:eastAsiaTheme="minorEastAsia"/>
+          <w:rFonts w:asciiTheme="minorHAnsi" w:eastAsiaTheme="minorEastAsia" w:hAnsiTheme="minorHAnsi" w:cstheme="minorBidi"/>
           <w:noProof/>
           <w:color w:val="auto"/>
           <w:kern w:val="2"/>
-          <w:sz w:val="22"/>
+          <w:sz w:val="24"/>
           <w:szCs w:val="24"/>
           <w14:ligatures w14:val="standardContextual"/>
         </w:rPr>
       </w:pPr>
-      <w:hyperlink w:anchor="_Toc244296996" w:history="1">
+      <w:hyperlink w:anchor="_Toc244297420" w:history="1">
         <w:r>
           <w:rPr>
             <w:rStyle w:val="Hyperlink"/>
             <w:noProof/>
-            <w:sz w:val="22"/>
           </w:rPr>
           <w:t>5.1. Các thành phần và hai chặng giao tiếp</w:t>
         </w:r>
@@ -1554,7 +1444,6 @@
           <w:rPr>
             <w:noProof/>
             <w:webHidden/>
-            <w:sz w:val="22"/>
           </w:rPr>
           <w:tab/>
         </w:r>
@@ -1562,7 +1451,6 @@
           <w:rPr>
             <w:noProof/>
             <w:webHidden/>
-            <w:sz w:val="22"/>
           </w:rPr>
           <w:fldChar w:fldCharType="begin"/>
         </w:r>
@@ -1570,22 +1458,19 @@
           <w:rPr>
             <w:noProof/>
             <w:webHidden/>
-            <w:sz w:val="22"/>
-          </w:rPr>
-          <w:instrText xml:space="preserve"> PAGEREF _Toc244296996 \h </w:instrText>
-        </w:r>
-        <w:r>
-          <w:rPr>
-            <w:noProof/>
-            <w:webHidden/>
-            <w:sz w:val="22"/>
-          </w:rPr>
-        </w:r>
-        <w:r>
-          <w:rPr>
-            <w:noProof/>
-            <w:webHidden/>
-            <w:sz w:val="22"/>
+          </w:rPr>
+          <w:instrText xml:space="preserve"> PAGEREF _Toc244297420 \h </w:instrText>
+        </w:r>
+        <w:r>
+          <w:rPr>
+            <w:noProof/>
+            <w:webHidden/>
+          </w:rPr>
+        </w:r>
+        <w:r>
+          <w:rPr>
+            <w:noProof/>
+            <w:webHidden/>
           </w:rPr>
           <w:fldChar w:fldCharType="separate"/>
         </w:r>
@@ -1593,7 +1478,6 @@
           <w:rPr>
             <w:noProof/>
             <w:webHidden/>
-            <w:sz w:val="22"/>
           </w:rPr>
           <w:t>8</w:t>
         </w:r>
@@ -1601,7 +1485,6 @@
           <w:rPr>
             <w:noProof/>
             <w:webHidden/>
-            <w:sz w:val="22"/>
           </w:rPr>
           <w:fldChar w:fldCharType="end"/>
         </w:r>
@@ -1613,23 +1496,21 @@
         <w:tabs>
           <w:tab w:val="right" w:leader="dot" w:pos="8778"/>
         </w:tabs>
-        <w:spacing w:after="0" w:line="240" w:lineRule="auto"/>
         <w:rPr>
-          <w:rFonts w:eastAsiaTheme="minorEastAsia"/>
+          <w:rFonts w:asciiTheme="minorHAnsi" w:eastAsiaTheme="minorEastAsia" w:hAnsiTheme="minorHAnsi" w:cstheme="minorBidi"/>
           <w:noProof/>
           <w:color w:val="auto"/>
           <w:kern w:val="2"/>
-          <w:sz w:val="22"/>
+          <w:sz w:val="24"/>
           <w:szCs w:val="24"/>
           <w14:ligatures w14:val="standardContextual"/>
         </w:rPr>
       </w:pPr>
-      <w:hyperlink w:anchor="_Toc244296997" w:history="1">
+      <w:hyperlink w:anchor="_Toc244297421" w:history="1">
         <w:r>
           <w:rPr>
             <w:rStyle w:val="Hyperlink"/>
             <w:noProof/>
-            <w:sz w:val="22"/>
           </w:rPr>
           <w:t>5.2. Xử lý nhiều kết nối đồng thời</w:t>
         </w:r>
@@ -1637,7 +1518,6 @@
           <w:rPr>
             <w:noProof/>
             <w:webHidden/>
-            <w:sz w:val="22"/>
           </w:rPr>
           <w:tab/>
         </w:r>
@@ -1645,7 +1525,6 @@
           <w:rPr>
             <w:noProof/>
             <w:webHidden/>
-            <w:sz w:val="22"/>
           </w:rPr>
           <w:fldChar w:fldCharType="begin"/>
         </w:r>
@@ -1653,22 +1532,19 @@
           <w:rPr>
             <w:noProof/>
             <w:webHidden/>
-            <w:sz w:val="22"/>
-          </w:rPr>
-          <w:instrText xml:space="preserve"> PAGEREF _Toc244296997 \h </w:instrText>
-        </w:r>
-        <w:r>
-          <w:rPr>
-            <w:noProof/>
-            <w:webHidden/>
-            <w:sz w:val="22"/>
-          </w:rPr>
-        </w:r>
-        <w:r>
-          <w:rPr>
-            <w:noProof/>
-            <w:webHidden/>
-            <w:sz w:val="22"/>
+          </w:rPr>
+          <w:instrText xml:space="preserve"> PAGEREF _Toc244297421 \h </w:instrText>
+        </w:r>
+        <w:r>
+          <w:rPr>
+            <w:noProof/>
+            <w:webHidden/>
+          </w:rPr>
+        </w:r>
+        <w:r>
+          <w:rPr>
+            <w:noProof/>
+            <w:webHidden/>
           </w:rPr>
           <w:fldChar w:fldCharType="separate"/>
         </w:r>
@@ -1676,7 +1552,6 @@
           <w:rPr>
             <w:noProof/>
             <w:webHidden/>
-            <w:sz w:val="22"/>
           </w:rPr>
           <w:t>9</w:t>
         </w:r>
@@ -1684,7 +1559,6 @@
           <w:rPr>
             <w:noProof/>
             <w:webHidden/>
-            <w:sz w:val="22"/>
           </w:rPr>
           <w:fldChar w:fldCharType="end"/>
         </w:r>
@@ -1696,23 +1570,21 @@
         <w:tabs>
           <w:tab w:val="right" w:leader="dot" w:pos="8778"/>
         </w:tabs>
-        <w:spacing w:after="0" w:line="240" w:lineRule="auto"/>
         <w:rPr>
-          <w:rFonts w:eastAsiaTheme="minorEastAsia"/>
+          <w:rFonts w:asciiTheme="minorHAnsi" w:eastAsiaTheme="minorEastAsia" w:hAnsiTheme="minorHAnsi" w:cstheme="minorBidi"/>
           <w:noProof/>
           <w:color w:val="auto"/>
           <w:kern w:val="2"/>
-          <w:sz w:val="22"/>
+          <w:sz w:val="24"/>
           <w:szCs w:val="24"/>
           <w14:ligatures w14:val="standardContextual"/>
         </w:rPr>
       </w:pPr>
-      <w:hyperlink w:anchor="_Toc244296998" w:history="1">
+      <w:hyperlink w:anchor="_Toc244297422" w:history="1">
         <w:r>
           <w:rPr>
             <w:rStyle w:val="Hyperlink"/>
             <w:noProof/>
-            <w:sz w:val="22"/>
           </w:rPr>
           <w:t>5.3. Lưu trữ và quyền dữ liệu</w:t>
         </w:r>
@@ -1720,7 +1592,6 @@
           <w:rPr>
             <w:noProof/>
             <w:webHidden/>
-            <w:sz w:val="22"/>
           </w:rPr>
           <w:tab/>
         </w:r>
@@ -1728,7 +1599,6 @@
           <w:rPr>
             <w:noProof/>
             <w:webHidden/>
-            <w:sz w:val="22"/>
           </w:rPr>
           <w:fldChar w:fldCharType="begin"/>
         </w:r>
@@ -1736,22 +1606,19 @@
           <w:rPr>
             <w:noProof/>
             <w:webHidden/>
-            <w:sz w:val="22"/>
-          </w:rPr>
-          <w:instrText xml:space="preserve"> PAGEREF _Toc244296998 \h </w:instrText>
-        </w:r>
-        <w:r>
-          <w:rPr>
-            <w:noProof/>
-            <w:webHidden/>
-            <w:sz w:val="22"/>
-          </w:rPr>
-        </w:r>
-        <w:r>
-          <w:rPr>
-            <w:noProof/>
-            <w:webHidden/>
-            <w:sz w:val="22"/>
+          </w:rPr>
+          <w:instrText xml:space="preserve"> PAGEREF _Toc244297422 \h </w:instrText>
+        </w:r>
+        <w:r>
+          <w:rPr>
+            <w:noProof/>
+            <w:webHidden/>
+          </w:rPr>
+        </w:r>
+        <w:r>
+          <w:rPr>
+            <w:noProof/>
+            <w:webHidden/>
           </w:rPr>
           <w:fldChar w:fldCharType="separate"/>
         </w:r>
@@ -1759,7 +1626,6 @@
           <w:rPr>
             <w:noProof/>
             <w:webHidden/>
-            <w:sz w:val="22"/>
           </w:rPr>
           <w:t>11</w:t>
         </w:r>
@@ -1767,7 +1633,6 @@
           <w:rPr>
             <w:noProof/>
             <w:webHidden/>
-            <w:sz w:val="22"/>
           </w:rPr>
           <w:fldChar w:fldCharType="end"/>
         </w:r>
@@ -1779,23 +1644,21 @@
         <w:tabs>
           <w:tab w:val="right" w:leader="dot" w:pos="8778"/>
         </w:tabs>
-        <w:spacing w:after="0" w:line="240" w:lineRule="auto"/>
         <w:rPr>
-          <w:rFonts w:eastAsiaTheme="minorEastAsia"/>
+          <w:rFonts w:asciiTheme="minorHAnsi" w:eastAsiaTheme="minorEastAsia" w:hAnsiTheme="minorHAnsi" w:cstheme="minorBidi"/>
           <w:noProof/>
           <w:color w:val="auto"/>
           <w:kern w:val="2"/>
-          <w:sz w:val="22"/>
+          <w:sz w:val="24"/>
           <w:szCs w:val="24"/>
           <w14:ligatures w14:val="standardContextual"/>
         </w:rPr>
       </w:pPr>
-      <w:hyperlink w:anchor="_Toc244296999" w:history="1">
+      <w:hyperlink w:anchor="_Toc244297423" w:history="1">
         <w:r>
           <w:rPr>
             <w:rStyle w:val="Hyperlink"/>
             <w:noProof/>
-            <w:sz w:val="22"/>
           </w:rPr>
           <w:t>6. THIẾT KẾ GIAO TIẾP MẠNG</w:t>
         </w:r>
@@ -1803,7 +1666,6 @@
           <w:rPr>
             <w:noProof/>
             <w:webHidden/>
-            <w:sz w:val="22"/>
           </w:rPr>
           <w:tab/>
         </w:r>
@@ -1811,7 +1673,6 @@
           <w:rPr>
             <w:noProof/>
             <w:webHidden/>
-            <w:sz w:val="22"/>
           </w:rPr>
           <w:fldChar w:fldCharType="begin"/>
         </w:r>
@@ -1819,22 +1680,19 @@
           <w:rPr>
             <w:noProof/>
             <w:webHidden/>
-            <w:sz w:val="22"/>
-          </w:rPr>
-          <w:instrText xml:space="preserve"> PAGEREF _Toc244296999 \h </w:instrText>
-        </w:r>
-        <w:r>
-          <w:rPr>
-            <w:noProof/>
-            <w:webHidden/>
-            <w:sz w:val="22"/>
-          </w:rPr>
-        </w:r>
-        <w:r>
-          <w:rPr>
-            <w:noProof/>
-            <w:webHidden/>
-            <w:sz w:val="22"/>
+          </w:rPr>
+          <w:instrText xml:space="preserve"> PAGEREF _Toc244297423 \h </w:instrText>
+        </w:r>
+        <w:r>
+          <w:rPr>
+            <w:noProof/>
+            <w:webHidden/>
+          </w:rPr>
+        </w:r>
+        <w:r>
+          <w:rPr>
+            <w:noProof/>
+            <w:webHidden/>
           </w:rPr>
           <w:fldChar w:fldCharType="separate"/>
         </w:r>
@@ -1842,7 +1700,6 @@
           <w:rPr>
             <w:noProof/>
             <w:webHidden/>
-            <w:sz w:val="22"/>
           </w:rPr>
           <w:t>12</w:t>
         </w:r>
@@ -1850,7 +1707,6 @@
           <w:rPr>
             <w:noProof/>
             <w:webHidden/>
-            <w:sz w:val="22"/>
           </w:rPr>
           <w:fldChar w:fldCharType="end"/>
         </w:r>
@@ -1862,23 +1718,21 @@
         <w:tabs>
           <w:tab w:val="right" w:leader="dot" w:pos="8778"/>
         </w:tabs>
-        <w:spacing w:after="0" w:line="240" w:lineRule="auto"/>
         <w:rPr>
-          <w:rFonts w:eastAsiaTheme="minorEastAsia"/>
+          <w:rFonts w:asciiTheme="minorHAnsi" w:eastAsiaTheme="minorEastAsia" w:hAnsiTheme="minorHAnsi" w:cstheme="minorBidi"/>
           <w:noProof/>
           <w:color w:val="auto"/>
           <w:kern w:val="2"/>
-          <w:sz w:val="22"/>
+          <w:sz w:val="24"/>
           <w:szCs w:val="24"/>
           <w14:ligatures w14:val="standardContextual"/>
         </w:rPr>
       </w:pPr>
-      <w:hyperlink w:anchor="_Toc244297000" w:history="1">
+      <w:hyperlink w:anchor="_Toc244297424" w:history="1">
         <w:r>
           <w:rPr>
             <w:rStyle w:val="Hyperlink"/>
             <w:noProof/>
-            <w:sz w:val="22"/>
           </w:rPr>
           <w:t>6.1. Định dạng bản tin trên TCP</w:t>
         </w:r>
@@ -1886,7 +1740,6 @@
           <w:rPr>
             <w:noProof/>
             <w:webHidden/>
-            <w:sz w:val="22"/>
           </w:rPr>
           <w:tab/>
         </w:r>
@@ -1894,7 +1747,6 @@
           <w:rPr>
             <w:noProof/>
             <w:webHidden/>
-            <w:sz w:val="22"/>
           </w:rPr>
           <w:fldChar w:fldCharType="begin"/>
         </w:r>
@@ -1902,22 +1754,19 @@
           <w:rPr>
             <w:noProof/>
             <w:webHidden/>
-            <w:sz w:val="22"/>
-          </w:rPr>
-          <w:instrText xml:space="preserve"> PAGEREF _Toc244297000 \h </w:instrText>
-        </w:r>
-        <w:r>
-          <w:rPr>
-            <w:noProof/>
-            <w:webHidden/>
-            <w:sz w:val="22"/>
-          </w:rPr>
-        </w:r>
-        <w:r>
-          <w:rPr>
-            <w:noProof/>
-            <w:webHidden/>
-            <w:sz w:val="22"/>
+          </w:rPr>
+          <w:instrText xml:space="preserve"> PAGEREF _Toc244297424 \h </w:instrText>
+        </w:r>
+        <w:r>
+          <w:rPr>
+            <w:noProof/>
+            <w:webHidden/>
+          </w:rPr>
+        </w:r>
+        <w:r>
+          <w:rPr>
+            <w:noProof/>
+            <w:webHidden/>
           </w:rPr>
           <w:fldChar w:fldCharType="separate"/>
         </w:r>
@@ -1925,7 +1774,6 @@
           <w:rPr>
             <w:noProof/>
             <w:webHidden/>
-            <w:sz w:val="22"/>
           </w:rPr>
           <w:t>12</w:t>
         </w:r>
@@ -1933,7 +1781,6 @@
           <w:rPr>
             <w:noProof/>
             <w:webHidden/>
-            <w:sz w:val="22"/>
           </w:rPr>
           <w:fldChar w:fldCharType="end"/>
         </w:r>
@@ -1945,23 +1792,21 @@
         <w:tabs>
           <w:tab w:val="right" w:leader="dot" w:pos="8778"/>
         </w:tabs>
-        <w:spacing w:after="0" w:line="240" w:lineRule="auto"/>
         <w:rPr>
-          <w:rFonts w:eastAsiaTheme="minorEastAsia"/>
+          <w:rFonts w:asciiTheme="minorHAnsi" w:eastAsiaTheme="minorEastAsia" w:hAnsiTheme="minorHAnsi" w:cstheme="minorBidi"/>
           <w:noProof/>
           <w:color w:val="auto"/>
           <w:kern w:val="2"/>
-          <w:sz w:val="22"/>
+          <w:sz w:val="24"/>
           <w:szCs w:val="24"/>
           <w14:ligatures w14:val="standardContextual"/>
         </w:rPr>
       </w:pPr>
-      <w:hyperlink w:anchor="_Toc244297001" w:history="1">
+      <w:hyperlink w:anchor="_Toc244297425" w:history="1">
         <w:r>
           <w:rPr>
             <w:rStyle w:val="Hyperlink"/>
             <w:noProof/>
-            <w:sz w:val="22"/>
           </w:rPr>
           <w:t>6.2. Vòng đời kết nối và ghép phản hồi</w:t>
         </w:r>
@@ -1969,7 +1814,6 @@
           <w:rPr>
             <w:noProof/>
             <w:webHidden/>
-            <w:sz w:val="22"/>
           </w:rPr>
           <w:tab/>
         </w:r>
@@ -1977,7 +1821,6 @@
           <w:rPr>
             <w:noProof/>
             <w:webHidden/>
-            <w:sz w:val="22"/>
           </w:rPr>
           <w:fldChar w:fldCharType="begin"/>
         </w:r>
@@ -1985,22 +1828,19 @@
           <w:rPr>
             <w:noProof/>
             <w:webHidden/>
-            <w:sz w:val="22"/>
-          </w:rPr>
-          <w:instrText xml:space="preserve"> PAGEREF _Toc244297001 \h </w:instrText>
-        </w:r>
-        <w:r>
-          <w:rPr>
-            <w:noProof/>
-            <w:webHidden/>
-            <w:sz w:val="22"/>
-          </w:rPr>
-        </w:r>
-        <w:r>
-          <w:rPr>
-            <w:noProof/>
-            <w:webHidden/>
-            <w:sz w:val="22"/>
+          </w:rPr>
+          <w:instrText xml:space="preserve"> PAGEREF _Toc244297425 \h </w:instrText>
+        </w:r>
+        <w:r>
+          <w:rPr>
+            <w:noProof/>
+            <w:webHidden/>
+          </w:rPr>
+        </w:r>
+        <w:r>
+          <w:rPr>
+            <w:noProof/>
+            <w:webHidden/>
           </w:rPr>
           <w:fldChar w:fldCharType="separate"/>
         </w:r>
@@ -2008,7 +1848,6 @@
           <w:rPr>
             <w:noProof/>
             <w:webHidden/>
-            <w:sz w:val="22"/>
           </w:rPr>
           <w:t>13</w:t>
         </w:r>
@@ -2016,7 +1855,6 @@
           <w:rPr>
             <w:noProof/>
             <w:webHidden/>
-            <w:sz w:val="22"/>
           </w:rPr>
           <w:fldChar w:fldCharType="end"/>
         </w:r>
@@ -2028,23 +1866,21 @@
         <w:tabs>
           <w:tab w:val="right" w:leader="dot" w:pos="8778"/>
         </w:tabs>
-        <w:spacing w:after="0" w:line="240" w:lineRule="auto"/>
         <w:rPr>
-          <w:rFonts w:eastAsiaTheme="minorEastAsia"/>
+          <w:rFonts w:asciiTheme="minorHAnsi" w:eastAsiaTheme="minorEastAsia" w:hAnsiTheme="minorHAnsi" w:cstheme="minorBidi"/>
           <w:noProof/>
           <w:color w:val="auto"/>
           <w:kern w:val="2"/>
-          <w:sz w:val="22"/>
+          <w:sz w:val="24"/>
           <w:szCs w:val="24"/>
           <w14:ligatures w14:val="standardContextual"/>
         </w:rPr>
       </w:pPr>
-      <w:hyperlink w:anchor="_Toc244297002" w:history="1">
+      <w:hyperlink w:anchor="_Toc244297426" w:history="1">
         <w:r>
           <w:rPr>
             <w:rStyle w:val="Hyperlink"/>
             <w:noProof/>
-            <w:sz w:val="22"/>
           </w:rPr>
           <w:t>6.3. Cập nhật thời gian thực và luồng gọi món</w:t>
         </w:r>
@@ -2052,7 +1888,6 @@
           <w:rPr>
             <w:noProof/>
             <w:webHidden/>
-            <w:sz w:val="22"/>
           </w:rPr>
           <w:tab/>
         </w:r>
@@ -2060,7 +1895,6 @@
           <w:rPr>
             <w:noProof/>
             <w:webHidden/>
-            <w:sz w:val="22"/>
           </w:rPr>
           <w:fldChar w:fldCharType="begin"/>
         </w:r>
@@ -2068,22 +1902,19 @@
           <w:rPr>
             <w:noProof/>
             <w:webHidden/>
-            <w:sz w:val="22"/>
-          </w:rPr>
-          <w:instrText xml:space="preserve"> PAGEREF _Toc244297002 \h </w:instrText>
-        </w:r>
-        <w:r>
-          <w:rPr>
-            <w:noProof/>
-            <w:webHidden/>
-            <w:sz w:val="22"/>
-          </w:rPr>
-        </w:r>
-        <w:r>
-          <w:rPr>
-            <w:noProof/>
-            <w:webHidden/>
-            <w:sz w:val="22"/>
+          </w:rPr>
+          <w:instrText xml:space="preserve"> PAGEREF _Toc244297426 \h </w:instrText>
+        </w:r>
+        <w:r>
+          <w:rPr>
+            <w:noProof/>
+            <w:webHidden/>
+          </w:rPr>
+        </w:r>
+        <w:r>
+          <w:rPr>
+            <w:noProof/>
+            <w:webHidden/>
           </w:rPr>
           <w:fldChar w:fldCharType="separate"/>
         </w:r>
@@ -2091,7 +1922,6 @@
           <w:rPr>
             <w:noProof/>
             <w:webHidden/>
-            <w:sz w:val="22"/>
           </w:rPr>
           <w:t>14</w:t>
         </w:r>
@@ -2099,7 +1929,6 @@
           <w:rPr>
             <w:noProof/>
             <w:webHidden/>
-            <w:sz w:val="22"/>
           </w:rPr>
           <w:fldChar w:fldCharType="end"/>
         </w:r>
@@ -2111,23 +1940,21 @@
         <w:tabs>
           <w:tab w:val="right" w:leader="dot" w:pos="8778"/>
         </w:tabs>
-        <w:spacing w:after="0" w:line="240" w:lineRule="auto"/>
         <w:rPr>
-          <w:rFonts w:eastAsiaTheme="minorEastAsia"/>
+          <w:rFonts w:asciiTheme="minorHAnsi" w:eastAsiaTheme="minorEastAsia" w:hAnsiTheme="minorHAnsi" w:cstheme="minorBidi"/>
           <w:noProof/>
           <w:color w:val="auto"/>
           <w:kern w:val="2"/>
-          <w:sz w:val="22"/>
+          <w:sz w:val="24"/>
           <w:szCs w:val="24"/>
           <w14:ligatures w14:val="standardContextual"/>
         </w:rPr>
       </w:pPr>
-      <w:hyperlink w:anchor="_Toc244297003" w:history="1">
+      <w:hyperlink w:anchor="_Toc244297427" w:history="1">
         <w:r>
           <w:rPr>
             <w:rStyle w:val="Hyperlink"/>
             <w:noProof/>
-            <w:sz w:val="22"/>
           </w:rPr>
           <w:t>6.4. Xử lý lỗi và bảo vệ truy cập</w:t>
         </w:r>
@@ -2135,7 +1962,6 @@
           <w:rPr>
             <w:noProof/>
             <w:webHidden/>
-            <w:sz w:val="22"/>
           </w:rPr>
           <w:tab/>
         </w:r>
@@ -2143,7 +1969,6 @@
           <w:rPr>
             <w:noProof/>
             <w:webHidden/>
-            <w:sz w:val="22"/>
           </w:rPr>
           <w:fldChar w:fldCharType="begin"/>
         </w:r>
@@ -2151,22 +1976,19 @@
           <w:rPr>
             <w:noProof/>
             <w:webHidden/>
-            <w:sz w:val="22"/>
-          </w:rPr>
-          <w:instrText xml:space="preserve"> PAGEREF _Toc244297003 \h </w:instrText>
-        </w:r>
-        <w:r>
-          <w:rPr>
-            <w:noProof/>
-            <w:webHidden/>
-            <w:sz w:val="22"/>
-          </w:rPr>
-        </w:r>
-        <w:r>
-          <w:rPr>
-            <w:noProof/>
-            <w:webHidden/>
-            <w:sz w:val="22"/>
+          </w:rPr>
+          <w:instrText xml:space="preserve"> PAGEREF _Toc244297427 \h </w:instrText>
+        </w:r>
+        <w:r>
+          <w:rPr>
+            <w:noProof/>
+            <w:webHidden/>
+          </w:rPr>
+        </w:r>
+        <w:r>
+          <w:rPr>
+            <w:noProof/>
+            <w:webHidden/>
           </w:rPr>
           <w:fldChar w:fldCharType="separate"/>
         </w:r>
@@ -2174,7 +1996,6 @@
           <w:rPr>
             <w:noProof/>
             <w:webHidden/>
-            <w:sz w:val="22"/>
           </w:rPr>
           <w:t>15</w:t>
         </w:r>
@@ -2182,7 +2003,6 @@
           <w:rPr>
             <w:noProof/>
             <w:webHidden/>
-            <w:sz w:val="22"/>
           </w:rPr>
           <w:fldChar w:fldCharType="end"/>
         </w:r>
@@ -2194,23 +2014,21 @@
         <w:tabs>
           <w:tab w:val="right" w:leader="dot" w:pos="8778"/>
         </w:tabs>
-        <w:spacing w:after="0" w:line="240" w:lineRule="auto"/>
         <w:rPr>
-          <w:rFonts w:eastAsiaTheme="minorEastAsia"/>
+          <w:rFonts w:asciiTheme="minorHAnsi" w:eastAsiaTheme="minorEastAsia" w:hAnsiTheme="minorHAnsi" w:cstheme="minorBidi"/>
           <w:noProof/>
           <w:color w:val="auto"/>
           <w:kern w:val="2"/>
-          <w:sz w:val="22"/>
+          <w:sz w:val="24"/>
           <w:szCs w:val="24"/>
           <w14:ligatures w14:val="standardContextual"/>
         </w:rPr>
       </w:pPr>
-      <w:hyperlink w:anchor="_Toc244297004" w:history="1">
+      <w:hyperlink w:anchor="_Toc244297428" w:history="1">
         <w:r>
           <w:rPr>
             <w:rStyle w:val="Hyperlink"/>
             <w:noProof/>
-            <w:sz w:val="22"/>
           </w:rPr>
           <w:t>7. TRIỂN KHAI VÀ CHỨC NĂNG HỆ THỐNG</w:t>
         </w:r>
@@ -2218,7 +2036,6 @@
           <w:rPr>
             <w:noProof/>
             <w:webHidden/>
-            <w:sz w:val="22"/>
           </w:rPr>
           <w:tab/>
         </w:r>
@@ -2226,7 +2043,6 @@
           <w:rPr>
             <w:noProof/>
             <w:webHidden/>
-            <w:sz w:val="22"/>
           </w:rPr>
           <w:fldChar w:fldCharType="begin"/>
         </w:r>
@@ -2234,22 +2050,19 @@
           <w:rPr>
             <w:noProof/>
             <w:webHidden/>
-            <w:sz w:val="22"/>
-          </w:rPr>
-          <w:instrText xml:space="preserve"> PAGEREF _Toc244297004 \h </w:instrText>
-        </w:r>
-        <w:r>
-          <w:rPr>
-            <w:noProof/>
-            <w:webHidden/>
-            <w:sz w:val="22"/>
-          </w:rPr>
-        </w:r>
-        <w:r>
-          <w:rPr>
-            <w:noProof/>
-            <w:webHidden/>
-            <w:sz w:val="22"/>
+          </w:rPr>
+          <w:instrText xml:space="preserve"> PAGEREF _Toc244297428 \h </w:instrText>
+        </w:r>
+        <w:r>
+          <w:rPr>
+            <w:noProof/>
+            <w:webHidden/>
+          </w:rPr>
+        </w:r>
+        <w:r>
+          <w:rPr>
+            <w:noProof/>
+            <w:webHidden/>
           </w:rPr>
           <w:fldChar w:fldCharType="separate"/>
         </w:r>
@@ -2257,7 +2070,6 @@
           <w:rPr>
             <w:noProof/>
             <w:webHidden/>
-            <w:sz w:val="22"/>
           </w:rPr>
           <w:t>16</w:t>
         </w:r>
@@ -2265,7 +2077,6 @@
           <w:rPr>
             <w:noProof/>
             <w:webHidden/>
-            <w:sz w:val="22"/>
           </w:rPr>
           <w:fldChar w:fldCharType="end"/>
         </w:r>
@@ -2277,23 +2088,21 @@
         <w:tabs>
           <w:tab w:val="right" w:leader="dot" w:pos="8778"/>
         </w:tabs>
-        <w:spacing w:after="0" w:line="240" w:lineRule="auto"/>
         <w:rPr>
-          <w:rFonts w:eastAsiaTheme="minorEastAsia"/>
+          <w:rFonts w:asciiTheme="minorHAnsi" w:eastAsiaTheme="minorEastAsia" w:hAnsiTheme="minorHAnsi" w:cstheme="minorBidi"/>
           <w:noProof/>
           <w:color w:val="auto"/>
           <w:kern w:val="2"/>
-          <w:sz w:val="22"/>
+          <w:sz w:val="24"/>
           <w:szCs w:val="24"/>
           <w14:ligatures w14:val="standardContextual"/>
         </w:rPr>
       </w:pPr>
-      <w:hyperlink w:anchor="_Toc244297005" w:history="1">
+      <w:hyperlink w:anchor="_Toc244297429" w:history="1">
         <w:r>
           <w:rPr>
             <w:rStyle w:val="Hyperlink"/>
             <w:noProof/>
-            <w:sz w:val="22"/>
           </w:rPr>
           <w:t>7.1. Các module chính</w:t>
         </w:r>
@@ -2301,7 +2110,6 @@
           <w:rPr>
             <w:noProof/>
             <w:webHidden/>
-            <w:sz w:val="22"/>
           </w:rPr>
           <w:tab/>
         </w:r>
@@ -2309,7 +2117,6 @@
           <w:rPr>
             <w:noProof/>
             <w:webHidden/>
-            <w:sz w:val="22"/>
           </w:rPr>
           <w:fldChar w:fldCharType="begin"/>
         </w:r>
@@ -2317,22 +2124,19 @@
           <w:rPr>
             <w:noProof/>
             <w:webHidden/>
-            <w:sz w:val="22"/>
-          </w:rPr>
-          <w:instrText xml:space="preserve"> PAGEREF _Toc244297005 \h </w:instrText>
-        </w:r>
-        <w:r>
-          <w:rPr>
-            <w:noProof/>
-            <w:webHidden/>
-            <w:sz w:val="22"/>
-          </w:rPr>
-        </w:r>
-        <w:r>
-          <w:rPr>
-            <w:noProof/>
-            <w:webHidden/>
-            <w:sz w:val="22"/>
+          </w:rPr>
+          <w:instrText xml:space="preserve"> PAGEREF _Toc244297429 \h </w:instrText>
+        </w:r>
+        <w:r>
+          <w:rPr>
+            <w:noProof/>
+            <w:webHidden/>
+          </w:rPr>
+        </w:r>
+        <w:r>
+          <w:rPr>
+            <w:noProof/>
+            <w:webHidden/>
           </w:rPr>
           <w:fldChar w:fldCharType="separate"/>
         </w:r>
@@ -2340,7 +2144,6 @@
           <w:rPr>
             <w:noProof/>
             <w:webHidden/>
-            <w:sz w:val="22"/>
           </w:rPr>
           <w:t>16</w:t>
         </w:r>
@@ -2348,7 +2151,6 @@
           <w:rPr>
             <w:noProof/>
             <w:webHidden/>
-            <w:sz w:val="22"/>
           </w:rPr>
           <w:fldChar w:fldCharType="end"/>
         </w:r>
@@ -2360,23 +2162,21 @@
         <w:tabs>
           <w:tab w:val="right" w:leader="dot" w:pos="8778"/>
         </w:tabs>
-        <w:spacing w:after="0" w:line="240" w:lineRule="auto"/>
         <w:rPr>
-          <w:rFonts w:eastAsiaTheme="minorEastAsia"/>
+          <w:rFonts w:asciiTheme="minorHAnsi" w:eastAsiaTheme="minorEastAsia" w:hAnsiTheme="minorHAnsi" w:cstheme="minorBidi"/>
           <w:noProof/>
           <w:color w:val="auto"/>
           <w:kern w:val="2"/>
-          <w:sz w:val="22"/>
+          <w:sz w:val="24"/>
           <w:szCs w:val="24"/>
           <w14:ligatures w14:val="standardContextual"/>
         </w:rPr>
       </w:pPr>
-      <w:hyperlink w:anchor="_Toc244297006" w:history="1">
+      <w:hyperlink w:anchor="_Toc244297430" w:history="1">
         <w:r>
           <w:rPr>
             <w:rStyle w:val="Hyperlink"/>
             <w:noProof/>
-            <w:sz w:val="22"/>
           </w:rPr>
           <w:t>7.2. Chức năng dành cho khách</w:t>
         </w:r>
@@ -2384,7 +2184,6 @@
           <w:rPr>
             <w:noProof/>
             <w:webHidden/>
-            <w:sz w:val="22"/>
           </w:rPr>
           <w:tab/>
         </w:r>
@@ -2392,7 +2191,6 @@
           <w:rPr>
             <w:noProof/>
             <w:webHidden/>
-            <w:sz w:val="22"/>
           </w:rPr>
           <w:fldChar w:fldCharType="begin"/>
         </w:r>
@@ -2400,22 +2198,19 @@
           <w:rPr>
             <w:noProof/>
             <w:webHidden/>
-            <w:sz w:val="22"/>
-          </w:rPr>
-          <w:instrText xml:space="preserve"> PAGEREF _Toc244297006 \h </w:instrText>
-        </w:r>
-        <w:r>
-          <w:rPr>
-            <w:noProof/>
-            <w:webHidden/>
-            <w:sz w:val="22"/>
-          </w:rPr>
-        </w:r>
-        <w:r>
-          <w:rPr>
-            <w:noProof/>
-            <w:webHidden/>
-            <w:sz w:val="22"/>
+          </w:rPr>
+          <w:instrText xml:space="preserve"> PAGEREF _Toc244297430 \h </w:instrText>
+        </w:r>
+        <w:r>
+          <w:rPr>
+            <w:noProof/>
+            <w:webHidden/>
+          </w:rPr>
+        </w:r>
+        <w:r>
+          <w:rPr>
+            <w:noProof/>
+            <w:webHidden/>
           </w:rPr>
           <w:fldChar w:fldCharType="separate"/>
         </w:r>
@@ -2423,7 +2218,6 @@
           <w:rPr>
             <w:noProof/>
             <w:webHidden/>
-            <w:sz w:val="22"/>
           </w:rPr>
           <w:t>17</w:t>
         </w:r>
@@ -2431,7 +2225,6 @@
           <w:rPr>
             <w:noProof/>
             <w:webHidden/>
-            <w:sz w:val="22"/>
           </w:rPr>
           <w:fldChar w:fldCharType="end"/>
         </w:r>
@@ -2443,23 +2236,21 @@
         <w:tabs>
           <w:tab w:val="right" w:leader="dot" w:pos="8778"/>
         </w:tabs>
-        <w:spacing w:after="0" w:line="240" w:lineRule="auto"/>
         <w:rPr>
-          <w:rFonts w:eastAsiaTheme="minorEastAsia"/>
+          <w:rFonts w:asciiTheme="minorHAnsi" w:eastAsiaTheme="minorEastAsia" w:hAnsiTheme="minorHAnsi" w:cstheme="minorBidi"/>
           <w:noProof/>
           <w:color w:val="auto"/>
           <w:kern w:val="2"/>
-          <w:sz w:val="22"/>
+          <w:sz w:val="24"/>
           <w:szCs w:val="24"/>
           <w14:ligatures w14:val="standardContextual"/>
         </w:rPr>
       </w:pPr>
-      <w:hyperlink w:anchor="_Toc244297007" w:history="1">
+      <w:hyperlink w:anchor="_Toc244297431" w:history="1">
         <w:r>
           <w:rPr>
             <w:rStyle w:val="Hyperlink"/>
             <w:noProof/>
-            <w:sz w:val="22"/>
           </w:rPr>
           <w:t>7.3. Chức năng dành cho quầy</w:t>
         </w:r>
@@ -2467,7 +2258,6 @@
           <w:rPr>
             <w:noProof/>
             <w:webHidden/>
-            <w:sz w:val="22"/>
           </w:rPr>
           <w:tab/>
         </w:r>
@@ -2475,7 +2265,6 @@
           <w:rPr>
             <w:noProof/>
             <w:webHidden/>
-            <w:sz w:val="22"/>
           </w:rPr>
           <w:fldChar w:fldCharType="begin"/>
         </w:r>
@@ -2483,22 +2272,19 @@
           <w:rPr>
             <w:noProof/>
             <w:webHidden/>
-            <w:sz w:val="22"/>
-          </w:rPr>
-          <w:instrText xml:space="preserve"> PAGEREF _Toc244297007 \h </w:instrText>
-        </w:r>
-        <w:r>
-          <w:rPr>
-            <w:noProof/>
-            <w:webHidden/>
-            <w:sz w:val="22"/>
-          </w:rPr>
-        </w:r>
-        <w:r>
-          <w:rPr>
-            <w:noProof/>
-            <w:webHidden/>
-            <w:sz w:val="22"/>
+          </w:rPr>
+          <w:instrText xml:space="preserve"> PAGEREF _Toc244297431 \h </w:instrText>
+        </w:r>
+        <w:r>
+          <w:rPr>
+            <w:noProof/>
+            <w:webHidden/>
+          </w:rPr>
+        </w:r>
+        <w:r>
+          <w:rPr>
+            <w:noProof/>
+            <w:webHidden/>
           </w:rPr>
           <w:fldChar w:fldCharType="separate"/>
         </w:r>
@@ -2506,7 +2292,6 @@
           <w:rPr>
             <w:noProof/>
             <w:webHidden/>
-            <w:sz w:val="22"/>
           </w:rPr>
           <w:t>18</w:t>
         </w:r>
@@ -2514,7 +2299,6 @@
           <w:rPr>
             <w:noProof/>
             <w:webHidden/>
-            <w:sz w:val="22"/>
           </w:rPr>
           <w:fldChar w:fldCharType="end"/>
         </w:r>
@@ -2526,23 +2310,21 @@
         <w:tabs>
           <w:tab w:val="right" w:leader="dot" w:pos="8778"/>
         </w:tabs>
-        <w:spacing w:after="0" w:line="240" w:lineRule="auto"/>
         <w:rPr>
-          <w:rFonts w:eastAsiaTheme="minorEastAsia"/>
+          <w:rFonts w:asciiTheme="minorHAnsi" w:eastAsiaTheme="minorEastAsia" w:hAnsiTheme="minorHAnsi" w:cstheme="minorBidi"/>
           <w:noProof/>
           <w:color w:val="auto"/>
           <w:kern w:val="2"/>
-          <w:sz w:val="22"/>
+          <w:sz w:val="24"/>
           <w:szCs w:val="24"/>
           <w14:ligatures w14:val="standardContextual"/>
         </w:rPr>
       </w:pPr>
-      <w:hyperlink w:anchor="_Toc244297008" w:history="1">
+      <w:hyperlink w:anchor="_Toc244297432" w:history="1">
         <w:r>
           <w:rPr>
             <w:rStyle w:val="Hyperlink"/>
             <w:noProof/>
-            <w:sz w:val="22"/>
           </w:rPr>
           <w:t>8. THIẾT LẬP KIỂM THỬ VÀ THỰC NGHIỆM</w:t>
         </w:r>
@@ -2550,7 +2332,6 @@
           <w:rPr>
             <w:noProof/>
             <w:webHidden/>
-            <w:sz w:val="22"/>
           </w:rPr>
           <w:tab/>
         </w:r>
@@ -2558,7 +2339,6 @@
           <w:rPr>
             <w:noProof/>
             <w:webHidden/>
-            <w:sz w:val="22"/>
           </w:rPr>
           <w:fldChar w:fldCharType="begin"/>
         </w:r>
@@ -2566,22 +2346,19 @@
           <w:rPr>
             <w:noProof/>
             <w:webHidden/>
-            <w:sz w:val="22"/>
-          </w:rPr>
-          <w:instrText xml:space="preserve"> PAGEREF _Toc244297008 \h </w:instrText>
-        </w:r>
-        <w:r>
-          <w:rPr>
-            <w:noProof/>
-            <w:webHidden/>
-            <w:sz w:val="22"/>
-          </w:rPr>
-        </w:r>
-        <w:r>
-          <w:rPr>
-            <w:noProof/>
-            <w:webHidden/>
-            <w:sz w:val="22"/>
+          </w:rPr>
+          <w:instrText xml:space="preserve"> PAGEREF _Toc244297432 \h </w:instrText>
+        </w:r>
+        <w:r>
+          <w:rPr>
+            <w:noProof/>
+            <w:webHidden/>
+          </w:rPr>
+        </w:r>
+        <w:r>
+          <w:rPr>
+            <w:noProof/>
+            <w:webHidden/>
           </w:rPr>
           <w:fldChar w:fldCharType="separate"/>
         </w:r>
@@ -2589,7 +2366,6 @@
           <w:rPr>
             <w:noProof/>
             <w:webHidden/>
-            <w:sz w:val="22"/>
           </w:rPr>
           <w:t>19</w:t>
         </w:r>
@@ -2597,7 +2373,6 @@
           <w:rPr>
             <w:noProof/>
             <w:webHidden/>
-            <w:sz w:val="22"/>
           </w:rPr>
           <w:fldChar w:fldCharType="end"/>
         </w:r>
@@ -2609,23 +2384,21 @@
         <w:tabs>
           <w:tab w:val="right" w:leader="dot" w:pos="8778"/>
         </w:tabs>
-        <w:spacing w:after="0" w:line="240" w:lineRule="auto"/>
         <w:rPr>
-          <w:rFonts w:eastAsiaTheme="minorEastAsia"/>
+          <w:rFonts w:asciiTheme="minorHAnsi" w:eastAsiaTheme="minorEastAsia" w:hAnsiTheme="minorHAnsi" w:cstheme="minorBidi"/>
           <w:noProof/>
           <w:color w:val="auto"/>
           <w:kern w:val="2"/>
-          <w:sz w:val="22"/>
+          <w:sz w:val="24"/>
           <w:szCs w:val="24"/>
           <w14:ligatures w14:val="standardContextual"/>
         </w:rPr>
       </w:pPr>
-      <w:hyperlink w:anchor="_Toc244297009" w:history="1">
+      <w:hyperlink w:anchor="_Toc244297433" w:history="1">
         <w:r>
           <w:rPr>
             <w:rStyle w:val="Hyperlink"/>
             <w:noProof/>
-            <w:sz w:val="22"/>
           </w:rPr>
           <w:t>8.1. Môi trường và phạm vi đánh giá</w:t>
         </w:r>
@@ -2633,7 +2406,6 @@
           <w:rPr>
             <w:noProof/>
             <w:webHidden/>
-            <w:sz w:val="22"/>
           </w:rPr>
           <w:tab/>
         </w:r>
@@ -2641,7 +2413,6 @@
           <w:rPr>
             <w:noProof/>
             <w:webHidden/>
-            <w:sz w:val="22"/>
           </w:rPr>
           <w:fldChar w:fldCharType="begin"/>
         </w:r>
@@ -2649,22 +2420,19 @@
           <w:rPr>
             <w:noProof/>
             <w:webHidden/>
-            <w:sz w:val="22"/>
-          </w:rPr>
-          <w:instrText xml:space="preserve"> PAGEREF _Toc244297009 \h </w:instrText>
-        </w:r>
-        <w:r>
-          <w:rPr>
-            <w:noProof/>
-            <w:webHidden/>
-            <w:sz w:val="22"/>
-          </w:rPr>
-        </w:r>
-        <w:r>
-          <w:rPr>
-            <w:noProof/>
-            <w:webHidden/>
-            <w:sz w:val="22"/>
+          </w:rPr>
+          <w:instrText xml:space="preserve"> PAGEREF _Toc244297433 \h </w:instrText>
+        </w:r>
+        <w:r>
+          <w:rPr>
+            <w:noProof/>
+            <w:webHidden/>
+          </w:rPr>
+        </w:r>
+        <w:r>
+          <w:rPr>
+            <w:noProof/>
+            <w:webHidden/>
           </w:rPr>
           <w:fldChar w:fldCharType="separate"/>
         </w:r>
@@ -2672,7 +2440,6 @@
           <w:rPr>
             <w:noProof/>
             <w:webHidden/>
-            <w:sz w:val="22"/>
           </w:rPr>
           <w:t>19</w:t>
         </w:r>
@@ -2680,7 +2447,6 @@
           <w:rPr>
             <w:noProof/>
             <w:webHidden/>
-            <w:sz w:val="22"/>
           </w:rPr>
           <w:fldChar w:fldCharType="end"/>
         </w:r>
@@ -2692,23 +2458,21 @@
         <w:tabs>
           <w:tab w:val="right" w:leader="dot" w:pos="8778"/>
         </w:tabs>
-        <w:spacing w:after="0" w:line="240" w:lineRule="auto"/>
         <w:rPr>
-          <w:rFonts w:eastAsiaTheme="minorEastAsia"/>
+          <w:rFonts w:asciiTheme="minorHAnsi" w:eastAsiaTheme="minorEastAsia" w:hAnsiTheme="minorHAnsi" w:cstheme="minorBidi"/>
           <w:noProof/>
           <w:color w:val="auto"/>
           <w:kern w:val="2"/>
-          <w:sz w:val="22"/>
+          <w:sz w:val="24"/>
           <w:szCs w:val="24"/>
           <w14:ligatures w14:val="standardContextual"/>
         </w:rPr>
       </w:pPr>
-      <w:hyperlink w:anchor="_Toc244297010" w:history="1">
+      <w:hyperlink w:anchor="_Toc244297434" w:history="1">
         <w:r>
           <w:rPr>
             <w:rStyle w:val="Hyperlink"/>
             <w:noProof/>
-            <w:sz w:val="22"/>
           </w:rPr>
           <w:t>8.2. Kịch bản chức năng và lỗi mạng</w:t>
         </w:r>
@@ -2716,7 +2480,6 @@
           <w:rPr>
             <w:noProof/>
             <w:webHidden/>
-            <w:sz w:val="22"/>
           </w:rPr>
           <w:tab/>
         </w:r>
@@ -2724,7 +2487,6 @@
           <w:rPr>
             <w:noProof/>
             <w:webHidden/>
-            <w:sz w:val="22"/>
           </w:rPr>
           <w:fldChar w:fldCharType="begin"/>
         </w:r>
@@ -2732,22 +2494,19 @@
           <w:rPr>
             <w:noProof/>
             <w:webHidden/>
-            <w:sz w:val="22"/>
-          </w:rPr>
-          <w:instrText xml:space="preserve"> PAGEREF _Toc244297010 \h </w:instrText>
-        </w:r>
-        <w:r>
-          <w:rPr>
-            <w:noProof/>
-            <w:webHidden/>
-            <w:sz w:val="22"/>
-          </w:rPr>
-        </w:r>
-        <w:r>
-          <w:rPr>
-            <w:noProof/>
-            <w:webHidden/>
-            <w:sz w:val="22"/>
+          </w:rPr>
+          <w:instrText xml:space="preserve"> PAGEREF _Toc244297434 \h </w:instrText>
+        </w:r>
+        <w:r>
+          <w:rPr>
+            <w:noProof/>
+            <w:webHidden/>
+          </w:rPr>
+        </w:r>
+        <w:r>
+          <w:rPr>
+            <w:noProof/>
+            <w:webHidden/>
           </w:rPr>
           <w:fldChar w:fldCharType="separate"/>
         </w:r>
@@ -2755,7 +2514,6 @@
           <w:rPr>
             <w:noProof/>
             <w:webHidden/>
-            <w:sz w:val="22"/>
           </w:rPr>
           <w:t>19</w:t>
         </w:r>
@@ -2763,7 +2521,6 @@
           <w:rPr>
             <w:noProof/>
             <w:webHidden/>
-            <w:sz w:val="22"/>
           </w:rPr>
           <w:fldChar w:fldCharType="end"/>
         </w:r>
@@ -2775,23 +2532,21 @@
         <w:tabs>
           <w:tab w:val="right" w:leader="dot" w:pos="8778"/>
         </w:tabs>
-        <w:spacing w:after="0" w:line="240" w:lineRule="auto"/>
         <w:rPr>
-          <w:rFonts w:eastAsiaTheme="minorEastAsia"/>
+          <w:rFonts w:asciiTheme="minorHAnsi" w:eastAsiaTheme="minorEastAsia" w:hAnsiTheme="minorHAnsi" w:cstheme="minorBidi"/>
           <w:noProof/>
           <w:color w:val="auto"/>
           <w:kern w:val="2"/>
-          <w:sz w:val="22"/>
+          <w:sz w:val="24"/>
           <w:szCs w:val="24"/>
           <w14:ligatures w14:val="standardContextual"/>
         </w:rPr>
       </w:pPr>
-      <w:hyperlink w:anchor="_Toc244297011" w:history="1">
+      <w:hyperlink w:anchor="_Toc244297435" w:history="1">
         <w:r>
           <w:rPr>
             <w:rStyle w:val="Hyperlink"/>
             <w:noProof/>
-            <w:sz w:val="22"/>
           </w:rPr>
           <w:t>8.3. Tải và các chỉ số sử dụng</w:t>
         </w:r>
@@ -2799,7 +2554,6 @@
           <w:rPr>
             <w:noProof/>
             <w:webHidden/>
-            <w:sz w:val="22"/>
           </w:rPr>
           <w:tab/>
         </w:r>
@@ -2807,7 +2561,6 @@
           <w:rPr>
             <w:noProof/>
             <w:webHidden/>
-            <w:sz w:val="22"/>
           </w:rPr>
           <w:fldChar w:fldCharType="begin"/>
         </w:r>
@@ -2815,22 +2568,19 @@
           <w:rPr>
             <w:noProof/>
             <w:webHidden/>
-            <w:sz w:val="22"/>
-          </w:rPr>
-          <w:instrText xml:space="preserve"> PAGEREF _Toc244297011 \h </w:instrText>
-        </w:r>
-        <w:r>
-          <w:rPr>
-            <w:noProof/>
-            <w:webHidden/>
-            <w:sz w:val="22"/>
-          </w:rPr>
-        </w:r>
-        <w:r>
-          <w:rPr>
-            <w:noProof/>
-            <w:webHidden/>
-            <w:sz w:val="22"/>
+          </w:rPr>
+          <w:instrText xml:space="preserve"> PAGEREF _Toc244297435 \h </w:instrText>
+        </w:r>
+        <w:r>
+          <w:rPr>
+            <w:noProof/>
+            <w:webHidden/>
+          </w:rPr>
+        </w:r>
+        <w:r>
+          <w:rPr>
+            <w:noProof/>
+            <w:webHidden/>
           </w:rPr>
           <w:fldChar w:fldCharType="separate"/>
         </w:r>
@@ -2838,7 +2588,6 @@
           <w:rPr>
             <w:noProof/>
             <w:webHidden/>
-            <w:sz w:val="22"/>
           </w:rPr>
           <w:t>20</w:t>
         </w:r>
@@ -2846,7 +2595,6 @@
           <w:rPr>
             <w:noProof/>
             <w:webHidden/>
-            <w:sz w:val="22"/>
           </w:rPr>
           <w:fldChar w:fldCharType="end"/>
         </w:r>
@@ -2858,23 +2606,21 @@
         <w:tabs>
           <w:tab w:val="right" w:leader="dot" w:pos="8778"/>
         </w:tabs>
-        <w:spacing w:after="0" w:line="240" w:lineRule="auto"/>
         <w:rPr>
-          <w:rFonts w:eastAsiaTheme="minorEastAsia"/>
+          <w:rFonts w:asciiTheme="minorHAnsi" w:eastAsiaTheme="minorEastAsia" w:hAnsiTheme="minorHAnsi" w:cstheme="minorBidi"/>
           <w:noProof/>
           <w:color w:val="auto"/>
           <w:kern w:val="2"/>
-          <w:sz w:val="22"/>
+          <w:sz w:val="24"/>
           <w:szCs w:val="24"/>
           <w14:ligatures w14:val="standardContextual"/>
         </w:rPr>
       </w:pPr>
-      <w:hyperlink w:anchor="_Toc244297012" w:history="1">
+      <w:hyperlink w:anchor="_Toc244297436" w:history="1">
         <w:r>
           <w:rPr>
             <w:rStyle w:val="Hyperlink"/>
             <w:noProof/>
-            <w:sz w:val="22"/>
           </w:rPr>
           <w:t>9. KẾT QUẢ KIỂM THỬ VÀ ĐÁNH GIÁ</w:t>
         </w:r>
@@ -2882,7 +2628,6 @@
           <w:rPr>
             <w:noProof/>
             <w:webHidden/>
-            <w:sz w:val="22"/>
           </w:rPr>
           <w:tab/>
         </w:r>
@@ -2890,7 +2635,6 @@
           <w:rPr>
             <w:noProof/>
             <w:webHidden/>
-            <w:sz w:val="22"/>
           </w:rPr>
           <w:fldChar w:fldCharType="begin"/>
         </w:r>
@@ -2898,22 +2642,19 @@
           <w:rPr>
             <w:noProof/>
             <w:webHidden/>
-            <w:sz w:val="22"/>
-          </w:rPr>
-          <w:instrText xml:space="preserve"> PAGEREF _Toc244297012 \h </w:instrText>
-        </w:r>
-        <w:r>
-          <w:rPr>
-            <w:noProof/>
-            <w:webHidden/>
-            <w:sz w:val="22"/>
-          </w:rPr>
-        </w:r>
-        <w:r>
-          <w:rPr>
-            <w:noProof/>
-            <w:webHidden/>
-            <w:sz w:val="22"/>
+          </w:rPr>
+          <w:instrText xml:space="preserve"> PAGEREF _Toc244297436 \h </w:instrText>
+        </w:r>
+        <w:r>
+          <w:rPr>
+            <w:noProof/>
+            <w:webHidden/>
+          </w:rPr>
+        </w:r>
+        <w:r>
+          <w:rPr>
+            <w:noProof/>
+            <w:webHidden/>
           </w:rPr>
           <w:fldChar w:fldCharType="separate"/>
         </w:r>
@@ -2921,7 +2662,6 @@
           <w:rPr>
             <w:noProof/>
             <w:webHidden/>
-            <w:sz w:val="22"/>
           </w:rPr>
           <w:t>21</w:t>
         </w:r>
@@ -2929,7 +2669,6 @@
           <w:rPr>
             <w:noProof/>
             <w:webHidden/>
-            <w:sz w:val="22"/>
           </w:rPr>
           <w:fldChar w:fldCharType="end"/>
         </w:r>
@@ -2941,23 +2680,21 @@
         <w:tabs>
           <w:tab w:val="right" w:leader="dot" w:pos="8778"/>
         </w:tabs>
-        <w:spacing w:after="0" w:line="240" w:lineRule="auto"/>
         <w:rPr>
-          <w:rFonts w:eastAsiaTheme="minorEastAsia"/>
+          <w:rFonts w:asciiTheme="minorHAnsi" w:eastAsiaTheme="minorEastAsia" w:hAnsiTheme="minorHAnsi" w:cstheme="minorBidi"/>
           <w:noProof/>
           <w:color w:val="auto"/>
           <w:kern w:val="2"/>
-          <w:sz w:val="22"/>
+          <w:sz w:val="24"/>
           <w:szCs w:val="24"/>
           <w14:ligatures w14:val="standardContextual"/>
         </w:rPr>
       </w:pPr>
-      <w:hyperlink w:anchor="_Toc244297013" w:history="1">
+      <w:hyperlink w:anchor="_Toc244297437" w:history="1">
         <w:r>
           <w:rPr>
             <w:rStyle w:val="Hyperlink"/>
             <w:noProof/>
-            <w:sz w:val="22"/>
           </w:rPr>
           <w:t>9.1. Kết quả các chức năng chính</w:t>
         </w:r>
@@ -2965,7 +2702,6 @@
           <w:rPr>
             <w:noProof/>
             <w:webHidden/>
-            <w:sz w:val="22"/>
           </w:rPr>
           <w:tab/>
         </w:r>
@@ -2973,7 +2709,6 @@
           <w:rPr>
             <w:noProof/>
             <w:webHidden/>
-            <w:sz w:val="22"/>
           </w:rPr>
           <w:fldChar w:fldCharType="begin"/>
         </w:r>
@@ -2981,22 +2716,19 @@
           <w:rPr>
             <w:noProof/>
             <w:webHidden/>
-            <w:sz w:val="22"/>
-          </w:rPr>
-          <w:instrText xml:space="preserve"> PAGEREF _Toc244297013 \h </w:instrText>
-        </w:r>
-        <w:r>
-          <w:rPr>
-            <w:noProof/>
-            <w:webHidden/>
-            <w:sz w:val="22"/>
-          </w:rPr>
-        </w:r>
-        <w:r>
-          <w:rPr>
-            <w:noProof/>
-            <w:webHidden/>
-            <w:sz w:val="22"/>
+          </w:rPr>
+          <w:instrText xml:space="preserve"> PAGEREF _Toc244297437 \h </w:instrText>
+        </w:r>
+        <w:r>
+          <w:rPr>
+            <w:noProof/>
+            <w:webHidden/>
+          </w:rPr>
+        </w:r>
+        <w:r>
+          <w:rPr>
+            <w:noProof/>
+            <w:webHidden/>
           </w:rPr>
           <w:fldChar w:fldCharType="separate"/>
         </w:r>
@@ -3004,7 +2736,6 @@
           <w:rPr>
             <w:noProof/>
             <w:webHidden/>
-            <w:sz w:val="22"/>
           </w:rPr>
           <w:t>21</w:t>
         </w:r>
@@ -3012,7 +2743,6 @@
           <w:rPr>
             <w:noProof/>
             <w:webHidden/>
-            <w:sz w:val="22"/>
           </w:rPr>
           <w:fldChar w:fldCharType="end"/>
         </w:r>
@@ -3024,23 +2754,21 @@
         <w:tabs>
           <w:tab w:val="right" w:leader="dot" w:pos="8778"/>
         </w:tabs>
-        <w:spacing w:after="0" w:line="240" w:lineRule="auto"/>
         <w:rPr>
-          <w:rFonts w:eastAsiaTheme="minorEastAsia"/>
+          <w:rFonts w:asciiTheme="minorHAnsi" w:eastAsiaTheme="minorEastAsia" w:hAnsiTheme="minorHAnsi" w:cstheme="minorBidi"/>
           <w:noProof/>
           <w:color w:val="auto"/>
           <w:kern w:val="2"/>
-          <w:sz w:val="22"/>
+          <w:sz w:val="24"/>
           <w:szCs w:val="24"/>
           <w14:ligatures w14:val="standardContextual"/>
         </w:rPr>
       </w:pPr>
-      <w:hyperlink w:anchor="_Toc244297014" w:history="1">
+      <w:hyperlink w:anchor="_Toc244297438" w:history="1">
         <w:r>
           <w:rPr>
             <w:rStyle w:val="Hyperlink"/>
             <w:noProof/>
-            <w:sz w:val="22"/>
           </w:rPr>
           <w:t>9.2. Kết quả giao tiếp Client/Server</w:t>
         </w:r>
@@ -3048,7 +2776,6 @@
           <w:rPr>
             <w:noProof/>
             <w:webHidden/>
-            <w:sz w:val="22"/>
           </w:rPr>
           <w:tab/>
         </w:r>
@@ -3056,7 +2783,6 @@
           <w:rPr>
             <w:noProof/>
             <w:webHidden/>
-            <w:sz w:val="22"/>
           </w:rPr>
           <w:fldChar w:fldCharType="begin"/>
         </w:r>
@@ -3064,22 +2790,19 @@
           <w:rPr>
             <w:noProof/>
             <w:webHidden/>
-            <w:sz w:val="22"/>
-          </w:rPr>
-          <w:instrText xml:space="preserve"> PAGEREF _Toc244297014 \h </w:instrText>
-        </w:r>
-        <w:r>
-          <w:rPr>
-            <w:noProof/>
-            <w:webHidden/>
-            <w:sz w:val="22"/>
-          </w:rPr>
-        </w:r>
-        <w:r>
-          <w:rPr>
-            <w:noProof/>
-            <w:webHidden/>
-            <w:sz w:val="22"/>
+          </w:rPr>
+          <w:instrText xml:space="preserve"> PAGEREF _Toc244297438 \h </w:instrText>
+        </w:r>
+        <w:r>
+          <w:rPr>
+            <w:noProof/>
+            <w:webHidden/>
+          </w:rPr>
+        </w:r>
+        <w:r>
+          <w:rPr>
+            <w:noProof/>
+            <w:webHidden/>
           </w:rPr>
           <w:fldChar w:fldCharType="separate"/>
         </w:r>
@@ -3087,7 +2810,6 @@
           <w:rPr>
             <w:noProof/>
             <w:webHidden/>
-            <w:sz w:val="22"/>
           </w:rPr>
           <w:t>22</w:t>
         </w:r>
@@ -3095,7 +2817,6 @@
           <w:rPr>
             <w:noProof/>
             <w:webHidden/>
-            <w:sz w:val="22"/>
           </w:rPr>
           <w:fldChar w:fldCharType="end"/>
         </w:r>
@@ -3107,23 +2828,21 @@
         <w:tabs>
           <w:tab w:val="right" w:leader="dot" w:pos="8778"/>
         </w:tabs>
-        <w:spacing w:after="0" w:line="240" w:lineRule="auto"/>
         <w:rPr>
-          <w:rFonts w:eastAsiaTheme="minorEastAsia"/>
+          <w:rFonts w:asciiTheme="minorHAnsi" w:eastAsiaTheme="minorEastAsia" w:hAnsiTheme="minorHAnsi" w:cstheme="minorBidi"/>
           <w:noProof/>
           <w:color w:val="auto"/>
           <w:kern w:val="2"/>
-          <w:sz w:val="22"/>
+          <w:sz w:val="24"/>
           <w:szCs w:val="24"/>
           <w14:ligatures w14:val="standardContextual"/>
         </w:rPr>
       </w:pPr>
-      <w:hyperlink w:anchor="_Toc244297015" w:history="1">
+      <w:hyperlink w:anchor="_Toc244297439" w:history="1">
         <w:r>
           <w:rPr>
             <w:rStyle w:val="Hyperlink"/>
             <w:noProof/>
-            <w:sz w:val="22"/>
           </w:rPr>
           <w:t>9.3. Kết quả khi tăng số khách đồng thời</w:t>
         </w:r>
@@ -3131,7 +2850,6 @@
           <w:rPr>
             <w:noProof/>
             <w:webHidden/>
-            <w:sz w:val="22"/>
           </w:rPr>
           <w:tab/>
         </w:r>
@@ -3139,7 +2857,6 @@
           <w:rPr>
             <w:noProof/>
             <w:webHidden/>
-            <w:sz w:val="22"/>
           </w:rPr>
           <w:fldChar w:fldCharType="begin"/>
         </w:r>
@@ -3147,22 +2864,19 @@
           <w:rPr>
             <w:noProof/>
             <w:webHidden/>
-            <w:sz w:val="22"/>
-          </w:rPr>
-          <w:instrText xml:space="preserve"> PAGEREF _Toc244297015 \h </w:instrText>
-        </w:r>
-        <w:r>
-          <w:rPr>
-            <w:noProof/>
-            <w:webHidden/>
-            <w:sz w:val="22"/>
-          </w:rPr>
-        </w:r>
-        <w:r>
-          <w:rPr>
-            <w:noProof/>
-            <w:webHidden/>
-            <w:sz w:val="22"/>
+          </w:rPr>
+          <w:instrText xml:space="preserve"> PAGEREF _Toc244297439 \h </w:instrText>
+        </w:r>
+        <w:r>
+          <w:rPr>
+            <w:noProof/>
+            <w:webHidden/>
+          </w:rPr>
+        </w:r>
+        <w:r>
+          <w:rPr>
+            <w:noProof/>
+            <w:webHidden/>
           </w:rPr>
           <w:fldChar w:fldCharType="separate"/>
         </w:r>
@@ -3170,7 +2884,6 @@
           <w:rPr>
             <w:noProof/>
             <w:webHidden/>
-            <w:sz w:val="22"/>
           </w:rPr>
           <w:t>22</w:t>
         </w:r>
@@ -3178,7 +2891,6 @@
           <w:rPr>
             <w:noProof/>
             <w:webHidden/>
-            <w:sz w:val="22"/>
           </w:rPr>
           <w:fldChar w:fldCharType="end"/>
         </w:r>
@@ -3190,23 +2902,21 @@
         <w:tabs>
           <w:tab w:val="right" w:leader="dot" w:pos="8778"/>
         </w:tabs>
-        <w:spacing w:after="0" w:line="240" w:lineRule="auto"/>
         <w:rPr>
-          <w:rFonts w:eastAsiaTheme="minorEastAsia"/>
+          <w:rFonts w:asciiTheme="minorHAnsi" w:eastAsiaTheme="minorEastAsia" w:hAnsiTheme="minorHAnsi" w:cstheme="minorBidi"/>
           <w:noProof/>
           <w:color w:val="auto"/>
           <w:kern w:val="2"/>
-          <w:sz w:val="22"/>
+          <w:sz w:val="24"/>
           <w:szCs w:val="24"/>
           <w14:ligatures w14:val="standardContextual"/>
         </w:rPr>
       </w:pPr>
-      <w:hyperlink w:anchor="_Toc244297016" w:history="1">
+      <w:hyperlink w:anchor="_Toc244297440" w:history="1">
         <w:r>
           <w:rPr>
             <w:rStyle w:val="Hyperlink"/>
             <w:noProof/>
-            <w:sz w:val="22"/>
           </w:rPr>
           <w:t>9.4. Kết quả so sánh phục hồi</w:t>
         </w:r>
@@ -3214,7 +2924,6 @@
           <w:rPr>
             <w:noProof/>
             <w:webHidden/>
-            <w:sz w:val="22"/>
           </w:rPr>
           <w:tab/>
         </w:r>
@@ -3222,7 +2931,6 @@
           <w:rPr>
             <w:noProof/>
             <w:webHidden/>
-            <w:sz w:val="22"/>
           </w:rPr>
           <w:fldChar w:fldCharType="begin"/>
         </w:r>
@@ -3230,22 +2938,19 @@
           <w:rPr>
             <w:noProof/>
             <w:webHidden/>
-            <w:sz w:val="22"/>
-          </w:rPr>
-          <w:instrText xml:space="preserve"> PAGEREF _Toc244297016 \h </w:instrText>
-        </w:r>
-        <w:r>
-          <w:rPr>
-            <w:noProof/>
-            <w:webHidden/>
-            <w:sz w:val="22"/>
-          </w:rPr>
-        </w:r>
-        <w:r>
-          <w:rPr>
-            <w:noProof/>
-            <w:webHidden/>
-            <w:sz w:val="22"/>
+          </w:rPr>
+          <w:instrText xml:space="preserve"> PAGEREF _Toc244297440 \h </w:instrText>
+        </w:r>
+        <w:r>
+          <w:rPr>
+            <w:noProof/>
+            <w:webHidden/>
+          </w:rPr>
+        </w:r>
+        <w:r>
+          <w:rPr>
+            <w:noProof/>
+            <w:webHidden/>
           </w:rPr>
           <w:fldChar w:fldCharType="separate"/>
         </w:r>
@@ -3253,7 +2958,6 @@
           <w:rPr>
             <w:noProof/>
             <w:webHidden/>
-            <w:sz w:val="22"/>
           </w:rPr>
           <w:t>23</w:t>
         </w:r>
@@ -3261,7 +2965,6 @@
           <w:rPr>
             <w:noProof/>
             <w:webHidden/>
-            <w:sz w:val="22"/>
           </w:rPr>
           <w:fldChar w:fldCharType="end"/>
         </w:r>
@@ -3273,23 +2976,21 @@
         <w:tabs>
           <w:tab w:val="right" w:leader="dot" w:pos="8778"/>
         </w:tabs>
-        <w:spacing w:after="0" w:line="240" w:lineRule="auto"/>
         <w:rPr>
-          <w:rFonts w:eastAsiaTheme="minorEastAsia"/>
+          <w:rFonts w:asciiTheme="minorHAnsi" w:eastAsiaTheme="minorEastAsia" w:hAnsiTheme="minorHAnsi" w:cstheme="minorBidi"/>
           <w:noProof/>
           <w:color w:val="auto"/>
           <w:kern w:val="2"/>
-          <w:sz w:val="22"/>
+          <w:sz w:val="24"/>
           <w:szCs w:val="24"/>
           <w14:ligatures w14:val="standardContextual"/>
         </w:rPr>
       </w:pPr>
-      <w:hyperlink w:anchor="_Toc244297017" w:history="1">
+      <w:hyperlink w:anchor="_Toc244297441" w:history="1">
         <w:r>
           <w:rPr>
             <w:rStyle w:val="Hyperlink"/>
             <w:noProof/>
-            <w:sz w:val="22"/>
           </w:rPr>
           <w:t>10. THẢO LUẬN</w:t>
         </w:r>
@@ -3297,7 +2998,6 @@
           <w:rPr>
             <w:noProof/>
             <w:webHidden/>
-            <w:sz w:val="22"/>
           </w:rPr>
           <w:tab/>
         </w:r>
@@ -3305,7 +3005,6 @@
           <w:rPr>
             <w:noProof/>
             <w:webHidden/>
-            <w:sz w:val="22"/>
           </w:rPr>
           <w:fldChar w:fldCharType="begin"/>
         </w:r>
@@ -3313,22 +3012,19 @@
           <w:rPr>
             <w:noProof/>
             <w:webHidden/>
-            <w:sz w:val="22"/>
-          </w:rPr>
-          <w:instrText xml:space="preserve"> PAGEREF _Toc244297017 \h </w:instrText>
-        </w:r>
-        <w:r>
-          <w:rPr>
-            <w:noProof/>
-            <w:webHidden/>
-            <w:sz w:val="22"/>
-          </w:rPr>
-        </w:r>
-        <w:r>
-          <w:rPr>
-            <w:noProof/>
-            <w:webHidden/>
-            <w:sz w:val="22"/>
+          </w:rPr>
+          <w:instrText xml:space="preserve"> PAGEREF _Toc244297441 \h </w:instrText>
+        </w:r>
+        <w:r>
+          <w:rPr>
+            <w:noProof/>
+            <w:webHidden/>
+          </w:rPr>
+        </w:r>
+        <w:r>
+          <w:rPr>
+            <w:noProof/>
+            <w:webHidden/>
           </w:rPr>
           <w:fldChar w:fldCharType="separate"/>
         </w:r>
@@ -3336,7 +3032,6 @@
           <w:rPr>
             <w:noProof/>
             <w:webHidden/>
-            <w:sz w:val="22"/>
           </w:rPr>
           <w:t>24</w:t>
         </w:r>
@@ -3344,7 +3039,6 @@
           <w:rPr>
             <w:noProof/>
             <w:webHidden/>
-            <w:sz w:val="22"/>
           </w:rPr>
           <w:fldChar w:fldCharType="end"/>
         </w:r>
@@ -3356,23 +3050,21 @@
         <w:tabs>
           <w:tab w:val="right" w:leader="dot" w:pos="8778"/>
         </w:tabs>
-        <w:spacing w:after="0" w:line="240" w:lineRule="auto"/>
         <w:rPr>
-          <w:rFonts w:eastAsiaTheme="minorEastAsia"/>
+          <w:rFonts w:asciiTheme="minorHAnsi" w:eastAsiaTheme="minorEastAsia" w:hAnsiTheme="minorHAnsi" w:cstheme="minorBidi"/>
           <w:noProof/>
           <w:color w:val="auto"/>
           <w:kern w:val="2"/>
-          <w:sz w:val="22"/>
+          <w:sz w:val="24"/>
           <w:szCs w:val="24"/>
           <w14:ligatures w14:val="standardContextual"/>
         </w:rPr>
       </w:pPr>
-      <w:hyperlink w:anchor="_Toc244297018" w:history="1">
+      <w:hyperlink w:anchor="_Toc244297442" w:history="1">
         <w:r>
           <w:rPr>
             <w:rStyle w:val="Hyperlink"/>
             <w:noProof/>
-            <w:sz w:val="22"/>
           </w:rPr>
           <w:t>11. ĐÓNG GÓP KỸ THUẬT</w:t>
         </w:r>
@@ -3380,7 +3072,6 @@
           <w:rPr>
             <w:noProof/>
             <w:webHidden/>
-            <w:sz w:val="22"/>
           </w:rPr>
           <w:tab/>
         </w:r>
@@ -3388,7 +3079,6 @@
           <w:rPr>
             <w:noProof/>
             <w:webHidden/>
-            <w:sz w:val="22"/>
           </w:rPr>
           <w:fldChar w:fldCharType="begin"/>
         </w:r>
@@ -3396,22 +3086,19 @@
           <w:rPr>
             <w:noProof/>
             <w:webHidden/>
-            <w:sz w:val="22"/>
-          </w:rPr>
-          <w:instrText xml:space="preserve"> PAGEREF _Toc244297018 \h </w:instrText>
-        </w:r>
-        <w:r>
-          <w:rPr>
-            <w:noProof/>
-            <w:webHidden/>
-            <w:sz w:val="22"/>
-          </w:rPr>
-        </w:r>
-        <w:r>
-          <w:rPr>
-            <w:noProof/>
-            <w:webHidden/>
-            <w:sz w:val="22"/>
+          </w:rPr>
+          <w:instrText xml:space="preserve"> PAGEREF _Toc244297442 \h </w:instrText>
+        </w:r>
+        <w:r>
+          <w:rPr>
+            <w:noProof/>
+            <w:webHidden/>
+          </w:rPr>
+        </w:r>
+        <w:r>
+          <w:rPr>
+            <w:noProof/>
+            <w:webHidden/>
           </w:rPr>
           <w:fldChar w:fldCharType="separate"/>
         </w:r>
@@ -3419,7 +3106,6 @@
           <w:rPr>
             <w:noProof/>
             <w:webHidden/>
-            <w:sz w:val="22"/>
           </w:rPr>
           <w:t>25</w:t>
         </w:r>
@@ -3427,7 +3113,6 @@
           <w:rPr>
             <w:noProof/>
             <w:webHidden/>
-            <w:sz w:val="22"/>
           </w:rPr>
           <w:fldChar w:fldCharType="end"/>
         </w:r>
@@ -3439,23 +3124,21 @@
         <w:tabs>
           <w:tab w:val="right" w:leader="dot" w:pos="8778"/>
         </w:tabs>
-        <w:spacing w:after="0" w:line="240" w:lineRule="auto"/>
         <w:rPr>
-          <w:rFonts w:eastAsiaTheme="minorEastAsia"/>
+          <w:rFonts w:asciiTheme="minorHAnsi" w:eastAsiaTheme="minorEastAsia" w:hAnsiTheme="minorHAnsi" w:cstheme="minorBidi"/>
           <w:noProof/>
           <w:color w:val="auto"/>
           <w:kern w:val="2"/>
-          <w:sz w:val="22"/>
+          <w:sz w:val="24"/>
           <w:szCs w:val="24"/>
           <w14:ligatures w14:val="standardContextual"/>
         </w:rPr>
       </w:pPr>
-      <w:hyperlink w:anchor="_Toc244297019" w:history="1">
+      <w:hyperlink w:anchor="_Toc244297443" w:history="1">
         <w:r>
           <w:rPr>
             <w:rStyle w:val="Hyperlink"/>
             <w:noProof/>
-            <w:sz w:val="22"/>
           </w:rPr>
           <w:t>12. HẠN CHẾ</w:t>
         </w:r>
@@ -3463,7 +3146,6 @@
           <w:rPr>
             <w:noProof/>
             <w:webHidden/>
-            <w:sz w:val="22"/>
           </w:rPr>
           <w:tab/>
         </w:r>
@@ -3471,7 +3153,6 @@
           <w:rPr>
             <w:noProof/>
             <w:webHidden/>
-            <w:sz w:val="22"/>
           </w:rPr>
           <w:fldChar w:fldCharType="begin"/>
         </w:r>
@@ -3479,22 +3160,19 @@
           <w:rPr>
             <w:noProof/>
             <w:webHidden/>
-            <w:sz w:val="22"/>
-          </w:rPr>
-          <w:instrText xml:space="preserve"> PAGEREF _Toc244297019 \h </w:instrText>
-        </w:r>
-        <w:r>
-          <w:rPr>
-            <w:noProof/>
-            <w:webHidden/>
-            <w:sz w:val="22"/>
-          </w:rPr>
-        </w:r>
-        <w:r>
-          <w:rPr>
-            <w:noProof/>
-            <w:webHidden/>
-            <w:sz w:val="22"/>
+          </w:rPr>
+          <w:instrText xml:space="preserve"> PAGEREF _Toc244297443 \h </w:instrText>
+        </w:r>
+        <w:r>
+          <w:rPr>
+            <w:noProof/>
+            <w:webHidden/>
+          </w:rPr>
+        </w:r>
+        <w:r>
+          <w:rPr>
+            <w:noProof/>
+            <w:webHidden/>
           </w:rPr>
           <w:fldChar w:fldCharType="separate"/>
         </w:r>
@@ -3502,7 +3180,6 @@
           <w:rPr>
             <w:noProof/>
             <w:webHidden/>
-            <w:sz w:val="22"/>
           </w:rPr>
           <w:t>26</w:t>
         </w:r>
@@ -3510,7 +3187,6 @@
           <w:rPr>
             <w:noProof/>
             <w:webHidden/>
-            <w:sz w:val="22"/>
           </w:rPr>
           <w:fldChar w:fldCharType="end"/>
         </w:r>
@@ -3522,23 +3198,21 @@
         <w:tabs>
           <w:tab w:val="right" w:leader="dot" w:pos="8778"/>
         </w:tabs>
-        <w:spacing w:after="0" w:line="240" w:lineRule="auto"/>
         <w:rPr>
-          <w:rFonts w:eastAsiaTheme="minorEastAsia"/>
+          <w:rFonts w:asciiTheme="minorHAnsi" w:eastAsiaTheme="minorEastAsia" w:hAnsiTheme="minorHAnsi" w:cstheme="minorBidi"/>
           <w:noProof/>
           <w:color w:val="auto"/>
           <w:kern w:val="2"/>
-          <w:sz w:val="22"/>
+          <w:sz w:val="24"/>
           <w:szCs w:val="24"/>
           <w14:ligatures w14:val="standardContextual"/>
         </w:rPr>
       </w:pPr>
-      <w:hyperlink w:anchor="_Toc244297020" w:history="1">
+      <w:hyperlink w:anchor="_Toc244297444" w:history="1">
         <w:r>
           <w:rPr>
             <w:rStyle w:val="Hyperlink"/>
             <w:noProof/>
-            <w:sz w:val="22"/>
           </w:rPr>
           <w:t>13. HƯỚNG PHÁT TRIỂN</w:t>
         </w:r>
@@ -3546,7 +3220,6 @@
           <w:rPr>
             <w:noProof/>
             <w:webHidden/>
-            <w:sz w:val="22"/>
           </w:rPr>
           <w:tab/>
         </w:r>
@@ -3554,7 +3227,6 @@
           <w:rPr>
             <w:noProof/>
             <w:webHidden/>
-            <w:sz w:val="22"/>
           </w:rPr>
           <w:fldChar w:fldCharType="begin"/>
         </w:r>
@@ -3562,22 +3234,19 @@
           <w:rPr>
             <w:noProof/>
             <w:webHidden/>
-            <w:sz w:val="22"/>
-          </w:rPr>
-          <w:instrText xml:space="preserve"> PAGEREF _Toc244297020 \h </w:instrText>
-        </w:r>
-        <w:r>
-          <w:rPr>
-            <w:noProof/>
-            <w:webHidden/>
-            <w:sz w:val="22"/>
-          </w:rPr>
-        </w:r>
-        <w:r>
-          <w:rPr>
-            <w:noProof/>
-            <w:webHidden/>
-            <w:sz w:val="22"/>
+          </w:rPr>
+          <w:instrText xml:space="preserve"> PAGEREF _Toc244297444 \h </w:instrText>
+        </w:r>
+        <w:r>
+          <w:rPr>
+            <w:noProof/>
+            <w:webHidden/>
+          </w:rPr>
+        </w:r>
+        <w:r>
+          <w:rPr>
+            <w:noProof/>
+            <w:webHidden/>
           </w:rPr>
           <w:fldChar w:fldCharType="separate"/>
         </w:r>
@@ -3585,7 +3254,6 @@
           <w:rPr>
             <w:noProof/>
             <w:webHidden/>
-            <w:sz w:val="22"/>
           </w:rPr>
           <w:t>26</w:t>
         </w:r>
@@ -3593,7 +3261,6 @@
           <w:rPr>
             <w:noProof/>
             <w:webHidden/>
-            <w:sz w:val="22"/>
           </w:rPr>
           <w:fldChar w:fldCharType="end"/>
         </w:r>
@@ -3605,23 +3272,21 @@
         <w:tabs>
           <w:tab w:val="right" w:leader="dot" w:pos="8778"/>
         </w:tabs>
-        <w:spacing w:after="0" w:line="240" w:lineRule="auto"/>
         <w:rPr>
-          <w:rFonts w:eastAsiaTheme="minorEastAsia"/>
+          <w:rFonts w:asciiTheme="minorHAnsi" w:eastAsiaTheme="minorEastAsia" w:hAnsiTheme="minorHAnsi" w:cstheme="minorBidi"/>
           <w:noProof/>
           <w:color w:val="auto"/>
           <w:kern w:val="2"/>
-          <w:sz w:val="22"/>
+          <w:sz w:val="24"/>
           <w:szCs w:val="24"/>
           <w14:ligatures w14:val="standardContextual"/>
         </w:rPr>
       </w:pPr>
-      <w:hyperlink w:anchor="_Toc244297021" w:history="1">
+      <w:hyperlink w:anchor="_Toc244297445" w:history="1">
         <w:r>
           <w:rPr>
             <w:rStyle w:val="Hyperlink"/>
             <w:noProof/>
-            <w:sz w:val="22"/>
           </w:rPr>
           <w:t>14. KẾT LUẬN</w:t>
         </w:r>
@@ -3629,7 +3294,6 @@
           <w:rPr>
             <w:noProof/>
             <w:webHidden/>
-            <w:sz w:val="22"/>
           </w:rPr>
           <w:tab/>
         </w:r>
@@ -3637,7 +3301,6 @@
           <w:rPr>
             <w:noProof/>
             <w:webHidden/>
-            <w:sz w:val="22"/>
           </w:rPr>
           <w:fldChar w:fldCharType="begin"/>
         </w:r>
@@ -3645,22 +3308,19 @@
           <w:rPr>
             <w:noProof/>
             <w:webHidden/>
-            <w:sz w:val="22"/>
-          </w:rPr>
-          <w:instrText xml:space="preserve"> PAGEREF _Toc244297021 \h </w:instrText>
-        </w:r>
-        <w:r>
-          <w:rPr>
-            <w:noProof/>
-            <w:webHidden/>
-            <w:sz w:val="22"/>
-          </w:rPr>
-        </w:r>
-        <w:r>
-          <w:rPr>
-            <w:noProof/>
-            <w:webHidden/>
-            <w:sz w:val="22"/>
+          </w:rPr>
+          <w:instrText xml:space="preserve"> PAGEREF _Toc244297445 \h </w:instrText>
+        </w:r>
+        <w:r>
+          <w:rPr>
+            <w:noProof/>
+            <w:webHidden/>
+          </w:rPr>
+        </w:r>
+        <w:r>
+          <w:rPr>
+            <w:noProof/>
+            <w:webHidden/>
           </w:rPr>
           <w:fldChar w:fldCharType="separate"/>
         </w:r>
@@ -3668,7 +3328,6 @@
           <w:rPr>
             <w:noProof/>
             <w:webHidden/>
-            <w:sz w:val="22"/>
           </w:rPr>
           <w:t>27</w:t>
         </w:r>
@@ -3676,7 +3335,6 @@
           <w:rPr>
             <w:noProof/>
             <w:webHidden/>
-            <w:sz w:val="22"/>
           </w:rPr>
           <w:fldChar w:fldCharType="end"/>
         </w:r>
@@ -3688,23 +3346,21 @@
         <w:tabs>
           <w:tab w:val="right" w:leader="dot" w:pos="8778"/>
         </w:tabs>
-        <w:spacing w:after="0" w:line="240" w:lineRule="auto"/>
         <w:rPr>
-          <w:rFonts w:eastAsiaTheme="minorEastAsia"/>
+          <w:rFonts w:asciiTheme="minorHAnsi" w:eastAsiaTheme="minorEastAsia" w:hAnsiTheme="minorHAnsi" w:cstheme="minorBidi"/>
           <w:noProof/>
           <w:color w:val="auto"/>
           <w:kern w:val="2"/>
-          <w:sz w:val="22"/>
+          <w:sz w:val="24"/>
           <w:szCs w:val="24"/>
           <w14:ligatures w14:val="standardContextual"/>
         </w:rPr>
       </w:pPr>
-      <w:hyperlink w:anchor="_Toc244297022" w:history="1">
+      <w:hyperlink w:anchor="_Toc244297446" w:history="1">
         <w:r>
           <w:rPr>
             <w:rStyle w:val="Hyperlink"/>
             <w:noProof/>
-            <w:sz w:val="22"/>
           </w:rPr>
           <w:t>15. TÀI LIỆU THAM KHẢO</w:t>
         </w:r>
@@ -3712,7 +3368,6 @@
           <w:rPr>
             <w:noProof/>
             <w:webHidden/>
-            <w:sz w:val="22"/>
           </w:rPr>
           <w:tab/>
         </w:r>
@@ -3720,7 +3375,6 @@
           <w:rPr>
             <w:noProof/>
             <w:webHidden/>
-            <w:sz w:val="22"/>
           </w:rPr>
           <w:fldChar w:fldCharType="begin"/>
         </w:r>
@@ -3728,22 +3382,19 @@
           <w:rPr>
             <w:noProof/>
             <w:webHidden/>
-            <w:sz w:val="22"/>
-          </w:rPr>
-          <w:instrText xml:space="preserve"> PAGEREF _Toc244297022 \h </w:instrText>
-        </w:r>
-        <w:r>
-          <w:rPr>
-            <w:noProof/>
-            <w:webHidden/>
-            <w:sz w:val="22"/>
-          </w:rPr>
-        </w:r>
-        <w:r>
-          <w:rPr>
-            <w:noProof/>
-            <w:webHidden/>
-            <w:sz w:val="22"/>
+          </w:rPr>
+          <w:instrText xml:space="preserve"> PAGEREF _Toc244297446 \h </w:instrText>
+        </w:r>
+        <w:r>
+          <w:rPr>
+            <w:noProof/>
+            <w:webHidden/>
+          </w:rPr>
+        </w:r>
+        <w:r>
+          <w:rPr>
+            <w:noProof/>
+            <w:webHidden/>
           </w:rPr>
           <w:fldChar w:fldCharType="separate"/>
         </w:r>
@@ -3751,7 +3402,6 @@
           <w:rPr>
             <w:noProof/>
             <w:webHidden/>
-            <w:sz w:val="22"/>
           </w:rPr>
           <w:t>28</w:t>
         </w:r>
@@ -3759,7 +3409,6 @@
           <w:rPr>
             <w:noProof/>
             <w:webHidden/>
-            <w:sz w:val="22"/>
           </w:rPr>
           <w:fldChar w:fldCharType="end"/>
         </w:r>
@@ -3771,23 +3420,21 @@
         <w:tabs>
           <w:tab w:val="right" w:leader="dot" w:pos="8778"/>
         </w:tabs>
-        <w:spacing w:after="0" w:line="240" w:lineRule="auto"/>
         <w:rPr>
-          <w:rFonts w:eastAsiaTheme="minorEastAsia"/>
+          <w:rFonts w:asciiTheme="minorHAnsi" w:eastAsiaTheme="minorEastAsia" w:hAnsiTheme="minorHAnsi" w:cstheme="minorBidi"/>
           <w:noProof/>
           <w:color w:val="auto"/>
           <w:kern w:val="2"/>
-          <w:sz w:val="22"/>
+          <w:sz w:val="24"/>
           <w:szCs w:val="24"/>
           <w14:ligatures w14:val="standardContextual"/>
         </w:rPr>
       </w:pPr>
-      <w:hyperlink w:anchor="_Toc244297023" w:history="1">
+      <w:hyperlink w:anchor="_Toc244297447" w:history="1">
         <w:r>
           <w:rPr>
             <w:rStyle w:val="Hyperlink"/>
             <w:noProof/>
-            <w:sz w:val="22"/>
           </w:rPr>
           <w:t>16. PHỤ LỤC</w:t>
         </w:r>
@@ -3795,7 +3442,6 @@
           <w:rPr>
             <w:noProof/>
             <w:webHidden/>
-            <w:sz w:val="22"/>
           </w:rPr>
           <w:tab/>
         </w:r>
@@ -3803,7 +3449,6 @@
           <w:rPr>
             <w:noProof/>
             <w:webHidden/>
-            <w:sz w:val="22"/>
           </w:rPr>
           <w:fldChar w:fldCharType="begin"/>
         </w:r>
@@ -3811,22 +3456,19 @@
           <w:rPr>
             <w:noProof/>
             <w:webHidden/>
-            <w:sz w:val="22"/>
-          </w:rPr>
-          <w:instrText xml:space="preserve"> PAGEREF _Toc244297023 \h </w:instrText>
-        </w:r>
-        <w:r>
-          <w:rPr>
-            <w:noProof/>
-            <w:webHidden/>
-            <w:sz w:val="22"/>
-          </w:rPr>
-        </w:r>
-        <w:r>
-          <w:rPr>
-            <w:noProof/>
-            <w:webHidden/>
-            <w:sz w:val="22"/>
+          </w:rPr>
+          <w:instrText xml:space="preserve"> PAGEREF _Toc244297447 \h </w:instrText>
+        </w:r>
+        <w:r>
+          <w:rPr>
+            <w:noProof/>
+            <w:webHidden/>
+          </w:rPr>
+        </w:r>
+        <w:r>
+          <w:rPr>
+            <w:noProof/>
+            <w:webHidden/>
           </w:rPr>
           <w:fldChar w:fldCharType="separate"/>
         </w:r>
@@ -3834,7 +3476,6 @@
           <w:rPr>
             <w:noProof/>
             <w:webHidden/>
-            <w:sz w:val="22"/>
           </w:rPr>
           <w:t>30</w:t>
         </w:r>
@@ -3842,7 +3483,6 @@
           <w:rPr>
             <w:noProof/>
             <w:webHidden/>
-            <w:sz w:val="22"/>
           </w:rPr>
           <w:fldChar w:fldCharType="end"/>
         </w:r>
@@ -3854,23 +3494,21 @@
         <w:tabs>
           <w:tab w:val="right" w:leader="dot" w:pos="8778"/>
         </w:tabs>
-        <w:spacing w:after="0" w:line="240" w:lineRule="auto"/>
         <w:rPr>
-          <w:rFonts w:eastAsiaTheme="minorEastAsia"/>
+          <w:rFonts w:asciiTheme="minorHAnsi" w:eastAsiaTheme="minorEastAsia" w:hAnsiTheme="minorHAnsi" w:cstheme="minorBidi"/>
           <w:noProof/>
           <w:color w:val="auto"/>
           <w:kern w:val="2"/>
-          <w:sz w:val="22"/>
+          <w:sz w:val="24"/>
           <w:szCs w:val="24"/>
           <w14:ligatures w14:val="standardContextual"/>
         </w:rPr>
       </w:pPr>
-      <w:hyperlink w:anchor="_Toc244297024" w:history="1">
+      <w:hyperlink w:anchor="_Toc244297448" w:history="1">
         <w:r>
           <w:rPr>
             <w:rStyle w:val="Hyperlink"/>
             <w:noProof/>
-            <w:sz w:val="22"/>
           </w:rPr>
           <w:t>A. Chi tiết giao thức và phục hồi</w:t>
         </w:r>
@@ -3878,7 +3516,6 @@
           <w:rPr>
             <w:noProof/>
             <w:webHidden/>
-            <w:sz w:val="22"/>
           </w:rPr>
           <w:tab/>
         </w:r>
@@ -3886,7 +3523,6 @@
           <w:rPr>
             <w:noProof/>
             <w:webHidden/>
-            <w:sz w:val="22"/>
           </w:rPr>
           <w:fldChar w:fldCharType="begin"/>
         </w:r>
@@ -3894,22 +3530,19 @@
           <w:rPr>
             <w:noProof/>
             <w:webHidden/>
-            <w:sz w:val="22"/>
-          </w:rPr>
-          <w:instrText xml:space="preserve"> PAGEREF _Toc244297024 \h </w:instrText>
-        </w:r>
-        <w:r>
-          <w:rPr>
-            <w:noProof/>
-            <w:webHidden/>
-            <w:sz w:val="22"/>
-          </w:rPr>
-        </w:r>
-        <w:r>
-          <w:rPr>
-            <w:noProof/>
-            <w:webHidden/>
-            <w:sz w:val="22"/>
+          </w:rPr>
+          <w:instrText xml:space="preserve"> PAGEREF _Toc244297448 \h </w:instrText>
+        </w:r>
+        <w:r>
+          <w:rPr>
+            <w:noProof/>
+            <w:webHidden/>
+          </w:rPr>
+        </w:r>
+        <w:r>
+          <w:rPr>
+            <w:noProof/>
+            <w:webHidden/>
           </w:rPr>
           <w:fldChar w:fldCharType="separate"/>
         </w:r>
@@ -3917,7 +3550,6 @@
           <w:rPr>
             <w:noProof/>
             <w:webHidden/>
-            <w:sz w:val="22"/>
           </w:rPr>
           <w:t>30</w:t>
         </w:r>
@@ -3925,7 +3557,6 @@
           <w:rPr>
             <w:noProof/>
             <w:webHidden/>
-            <w:sz w:val="22"/>
           </w:rPr>
           <w:fldChar w:fldCharType="end"/>
         </w:r>
@@ -3937,23 +3568,21 @@
         <w:tabs>
           <w:tab w:val="right" w:leader="dot" w:pos="8778"/>
         </w:tabs>
-        <w:spacing w:after="0" w:line="240" w:lineRule="auto"/>
         <w:rPr>
-          <w:rFonts w:eastAsiaTheme="minorEastAsia"/>
+          <w:rFonts w:asciiTheme="minorHAnsi" w:eastAsiaTheme="minorEastAsia" w:hAnsiTheme="minorHAnsi" w:cstheme="minorBidi"/>
           <w:noProof/>
           <w:color w:val="auto"/>
           <w:kern w:val="2"/>
-          <w:sz w:val="22"/>
+          <w:sz w:val="24"/>
           <w:szCs w:val="24"/>
           <w14:ligatures w14:val="standardContextual"/>
         </w:rPr>
       </w:pPr>
-      <w:hyperlink w:anchor="_Toc244297025" w:history="1">
+      <w:hyperlink w:anchor="_Toc244297449" w:history="1">
         <w:r>
           <w:rPr>
             <w:rStyle w:val="Hyperlink"/>
             <w:noProof/>
-            <w:sz w:val="22"/>
           </w:rPr>
           <w:t>B. Kết quả từng lượt đo ngày 30/10</w:t>
         </w:r>
@@ -3961,7 +3590,6 @@
           <w:rPr>
             <w:noProof/>
             <w:webHidden/>
-            <w:sz w:val="22"/>
           </w:rPr>
           <w:tab/>
         </w:r>
@@ -3969,7 +3597,6 @@
           <w:rPr>
             <w:noProof/>
             <w:webHidden/>
-            <w:sz w:val="22"/>
           </w:rPr>
           <w:fldChar w:fldCharType="begin"/>
         </w:r>
@@ -3977,22 +3604,19 @@
           <w:rPr>
             <w:noProof/>
             <w:webHidden/>
-            <w:sz w:val="22"/>
-          </w:rPr>
-          <w:instrText xml:space="preserve"> PAGEREF _Toc244297025 \h </w:instrText>
-        </w:r>
-        <w:r>
-          <w:rPr>
-            <w:noProof/>
-            <w:webHidden/>
-            <w:sz w:val="22"/>
-          </w:rPr>
-        </w:r>
-        <w:r>
-          <w:rPr>
-            <w:noProof/>
-            <w:webHidden/>
-            <w:sz w:val="22"/>
+          </w:rPr>
+          <w:instrText xml:space="preserve"> PAGEREF _Toc244297449 \h </w:instrText>
+        </w:r>
+        <w:r>
+          <w:rPr>
+            <w:noProof/>
+            <w:webHidden/>
+          </w:rPr>
+        </w:r>
+        <w:r>
+          <w:rPr>
+            <w:noProof/>
+            <w:webHidden/>
           </w:rPr>
           <w:fldChar w:fldCharType="separate"/>
         </w:r>
@@ -4000,7 +3624,6 @@
           <w:rPr>
             <w:noProof/>
             <w:webHidden/>
-            <w:sz w:val="22"/>
           </w:rPr>
           <w:t>32</w:t>
         </w:r>
@@ -4008,7 +3631,6 @@
           <w:rPr>
             <w:noProof/>
             <w:webHidden/>
-            <w:sz w:val="22"/>
           </w:rPr>
           <w:fldChar w:fldCharType="end"/>
         </w:r>
@@ -4020,23 +3642,21 @@
         <w:tabs>
           <w:tab w:val="right" w:leader="dot" w:pos="8778"/>
         </w:tabs>
-        <w:spacing w:after="0" w:line="240" w:lineRule="auto"/>
         <w:rPr>
-          <w:rFonts w:eastAsiaTheme="minorEastAsia"/>
+          <w:rFonts w:asciiTheme="minorHAnsi" w:eastAsiaTheme="minorEastAsia" w:hAnsiTheme="minorHAnsi" w:cstheme="minorBidi"/>
           <w:noProof/>
           <w:color w:val="auto"/>
           <w:kern w:val="2"/>
-          <w:sz w:val="22"/>
+          <w:sz w:val="24"/>
           <w:szCs w:val="24"/>
           <w14:ligatures w14:val="standardContextual"/>
         </w:rPr>
       </w:pPr>
-      <w:hyperlink w:anchor="_Toc244297026" w:history="1">
+      <w:hyperlink w:anchor="_Toc244297450" w:history="1">
         <w:r>
           <w:rPr>
             <w:rStyle w:val="Hyperlink"/>
             <w:noProof/>
-            <w:sz w:val="22"/>
           </w:rPr>
           <w:t>C. Kết quả đối chiếu của đợt ngày 25/10</w:t>
         </w:r>
@@ -4044,7 +3664,6 @@
           <w:rPr>
             <w:noProof/>
             <w:webHidden/>
-            <w:sz w:val="22"/>
           </w:rPr>
           <w:tab/>
         </w:r>
@@ -4052,7 +3671,6 @@
           <w:rPr>
             <w:noProof/>
             <w:webHidden/>
-            <w:sz w:val="22"/>
           </w:rPr>
           <w:fldChar w:fldCharType="begin"/>
         </w:r>
@@ -4060,22 +3678,19 @@
           <w:rPr>
             <w:noProof/>
             <w:webHidden/>
-            <w:sz w:val="22"/>
-          </w:rPr>
-          <w:instrText xml:space="preserve"> PAGEREF _Toc244297026 \h </w:instrText>
-        </w:r>
-        <w:r>
-          <w:rPr>
-            <w:noProof/>
-            <w:webHidden/>
-            <w:sz w:val="22"/>
-          </w:rPr>
-        </w:r>
-        <w:r>
-          <w:rPr>
-            <w:noProof/>
-            <w:webHidden/>
-            <w:sz w:val="22"/>
+          </w:rPr>
+          <w:instrText xml:space="preserve"> PAGEREF _Toc244297450 \h </w:instrText>
+        </w:r>
+        <w:r>
+          <w:rPr>
+            <w:noProof/>
+            <w:webHidden/>
+          </w:rPr>
+        </w:r>
+        <w:r>
+          <w:rPr>
+            <w:noProof/>
+            <w:webHidden/>
           </w:rPr>
           <w:fldChar w:fldCharType="separate"/>
         </w:r>
@@ -4083,7 +3698,6 @@
           <w:rPr>
             <w:noProof/>
             <w:webHidden/>
-            <w:sz w:val="22"/>
           </w:rPr>
           <w:t>32</w:t>
         </w:r>
@@ -4091,7 +3705,6 @@
           <w:rPr>
             <w:noProof/>
             <w:webHidden/>
-            <w:sz w:val="22"/>
           </w:rPr>
           <w:fldChar w:fldCharType="end"/>
         </w:r>
@@ -4438,7 +4051,7 @@
               <w:rPr>
                 <w:sz w:val="20"/>
               </w:rPr>
-              <w:t xml:space="preserve">Nguyễn Đình Quang </w:t>
+              <w:t>Nguyễn Đình Quang Huy</w:t>
             </w:r>
           </w:p>
         </w:tc>
@@ -4458,7 +4071,7 @@
               <w:rPr>
                 <w:sz w:val="20"/>
               </w:rPr>
-              <w:t>B23DCCN396</w:t>
+              <w:t>B23DCCN393</w:t>
             </w:r>
           </w:p>
         </w:tc>
@@ -7380,7 +6993,7 @@
         <w:pStyle w:val="Heading1"/>
         <w:pageBreakBefore/>
       </w:pPr>
-      <w:bookmarkStart w:id="0" w:name="_Toc244296984"/>
+      <w:bookmarkStart w:id="0" w:name="_Toc244297408"/>
       <w:r>
         <w:lastRenderedPageBreak/>
         <w:t>TÓM TẮT - ABSTRACT</w:t>
@@ -7418,7 +7031,7 @@
       <w:pPr>
         <w:pStyle w:val="Heading1"/>
       </w:pPr>
-      <w:bookmarkStart w:id="1" w:name="_Toc244296985"/>
+      <w:bookmarkStart w:id="1" w:name="_Toc244297409"/>
       <w:r>
         <w:lastRenderedPageBreak/>
         <w:t>1. GIỚI THIỆU</w:t>
@@ -7449,7 +7062,7 @@
       <w:pPr>
         <w:pStyle w:val="Heading1"/>
       </w:pPr>
-      <w:bookmarkStart w:id="2" w:name="_Toc244296986"/>
+      <w:bookmarkStart w:id="2" w:name="_Toc244297410"/>
       <w:r>
         <w:lastRenderedPageBreak/>
         <w:t>2. KIẾN THỨC NỀN VÀ CÔNG TRÌNH LIÊN QUAN</w:t>
@@ -7480,7 +7093,7 @@
       <w:pPr>
         <w:pStyle w:val="Heading1"/>
       </w:pPr>
-      <w:bookmarkStart w:id="3" w:name="_Toc244296987"/>
+      <w:bookmarkStart w:id="3" w:name="_Toc244297411"/>
       <w:r>
         <w:lastRenderedPageBreak/>
         <w:t>3. ĐỊNH NGHĨA BÀI TOÁN</w:t>
@@ -7491,7 +7104,7 @@
       <w:pPr>
         <w:pStyle w:val="Heading2"/>
       </w:pPr>
-      <w:bookmarkStart w:id="4" w:name="_Toc244296988"/>
+      <w:bookmarkStart w:id="4" w:name="_Toc244297412"/>
       <w:r>
         <w:t>3.1. Người dùng và phạm vi hệ thống</w:t>
       </w:r>
@@ -7851,7 +7464,7 @@
       <w:pPr>
         <w:pStyle w:val="Heading2"/>
       </w:pPr>
-      <w:bookmarkStart w:id="6" w:name="_Toc244296989"/>
+      <w:bookmarkStart w:id="6" w:name="_Toc244297413"/>
       <w:r>
         <w:t>3.2. Luồng nghiệp vụ chính</w:t>
       </w:r>
@@ -7951,7 +7564,7 @@
       <w:pPr>
         <w:pStyle w:val="Heading2"/>
       </w:pPr>
-      <w:bookmarkStart w:id="8" w:name="_Toc244296990"/>
+      <w:bookmarkStart w:id="8" w:name="_Toc244297414"/>
       <w:r>
         <w:t>3.3. Điều kiện cần giữ đúng</w:t>
       </w:r>
@@ -7971,7 +7584,7 @@
       <w:pPr>
         <w:pStyle w:val="Heading1"/>
       </w:pPr>
-      <w:bookmarkStart w:id="9" w:name="_Toc244296991"/>
+      <w:bookmarkStart w:id="9" w:name="_Toc244297415"/>
       <w:r>
         <w:lastRenderedPageBreak/>
         <w:t>4. GIẢI PHÁP ĐỀ XUẤT</w:t>
@@ -7982,7 +7595,7 @@
       <w:pPr>
         <w:pStyle w:val="Heading2"/>
       </w:pPr>
-      <w:bookmarkStart w:id="10" w:name="_Toc244296992"/>
+      <w:bookmarkStart w:id="10" w:name="_Toc244297416"/>
       <w:r>
         <w:t>4.1. Tổ chức luồng gọi món và điều phối</w:t>
       </w:r>
@@ -8002,7 +7615,7 @@
       <w:pPr>
         <w:pStyle w:val="Heading2"/>
       </w:pPr>
-      <w:bookmarkStart w:id="11" w:name="_Toc244296993"/>
+      <w:bookmarkStart w:id="11" w:name="_Toc244297417"/>
       <w:r>
         <w:t>4.2. Phục hồi theo loại yêu cầu</w:t>
       </w:r>
@@ -8447,7 +8060,7 @@
       <w:pPr>
         <w:pStyle w:val="Heading2"/>
       </w:pPr>
-      <w:bookmarkStart w:id="14" w:name="_Toc244296994"/>
+      <w:bookmarkStart w:id="14" w:name="_Toc244297418"/>
       <w:r>
         <w:lastRenderedPageBreak/>
         <w:t>4.3. Ghi nhớ quyết định bỏ và bảo vệ phiên</w:t>
@@ -8469,7 +8082,7 @@
         <w:pStyle w:val="Heading1"/>
         <w:pageBreakBefore/>
       </w:pPr>
-      <w:bookmarkStart w:id="15" w:name="_Toc244296995"/>
+      <w:bookmarkStart w:id="15" w:name="_Toc244297419"/>
       <w:r>
         <w:lastRenderedPageBreak/>
         <w:t>5. KIẾN TRÚC HỆ THỐNG</w:t>
@@ -8480,7 +8093,7 @@
       <w:pPr>
         <w:pStyle w:val="Heading2"/>
       </w:pPr>
-      <w:bookmarkStart w:id="16" w:name="_Toc244296996"/>
+      <w:bookmarkStart w:id="16" w:name="_Toc244297420"/>
       <w:r>
         <w:t>5.1. Các thành phần và hai chặng giao tiếp</w:t>
       </w:r>
@@ -8925,7 +8538,7 @@
       <w:pPr>
         <w:pStyle w:val="Heading2"/>
       </w:pPr>
-      <w:bookmarkStart w:id="19" w:name="_Toc244296997"/>
+      <w:bookmarkStart w:id="19" w:name="_Toc244297421"/>
       <w:r>
         <w:t>5.2. Xử lý nhiều kết nối đồng thời</w:t>
       </w:r>
@@ -9030,7 +8643,7 @@
       <w:pPr>
         <w:pStyle w:val="Heading2"/>
       </w:pPr>
-      <w:bookmarkStart w:id="21" w:name="_Toc244296998"/>
+      <w:bookmarkStart w:id="21" w:name="_Toc244297422"/>
       <w:r>
         <w:lastRenderedPageBreak/>
         <w:t>5.3. Lưu trữ và quyền dữ liệu</w:t>
@@ -9126,7 +8739,7 @@
         <w:pStyle w:val="Heading1"/>
         <w:pageBreakBefore/>
       </w:pPr>
-      <w:bookmarkStart w:id="23" w:name="_Toc244296999"/>
+      <w:bookmarkStart w:id="23" w:name="_Toc244297423"/>
       <w:r>
         <w:lastRenderedPageBreak/>
         <w:t>6. THIẾT KẾ GIAO TIẾP MẠNG</w:t>
@@ -9137,7 +8750,7 @@
       <w:pPr>
         <w:pStyle w:val="Heading2"/>
       </w:pPr>
-      <w:bookmarkStart w:id="24" w:name="_Toc244297000"/>
+      <w:bookmarkStart w:id="24" w:name="_Toc244297424"/>
       <w:r>
         <w:t>6.1. Định dạng bản tin trên TCP</w:t>
       </w:r>
@@ -9682,7 +9295,7 @@
       <w:pPr>
         <w:pStyle w:val="Heading2"/>
       </w:pPr>
-      <w:bookmarkStart w:id="27" w:name="_Toc244297001"/>
+      <w:bookmarkStart w:id="27" w:name="_Toc244297425"/>
       <w:r>
         <w:t>6.2. Vòng đời kết nối và ghép phản hồi</w:t>
       </w:r>
@@ -9708,7 +9321,7 @@
       <w:pPr>
         <w:pStyle w:val="Heading2"/>
       </w:pPr>
-      <w:bookmarkStart w:id="28" w:name="_Toc244297002"/>
+      <w:bookmarkStart w:id="28" w:name="_Toc244297426"/>
       <w:r>
         <w:t>6.3. Cập nhật thời gian thực và luồng gọi món</w:t>
       </w:r>
@@ -9808,7 +9421,7 @@
       <w:pPr>
         <w:pStyle w:val="Heading2"/>
       </w:pPr>
-      <w:bookmarkStart w:id="30" w:name="_Toc244297003"/>
+      <w:bookmarkStart w:id="30" w:name="_Toc244297427"/>
       <w:r>
         <w:t>6.4. Xử lý lỗi và bảo vệ truy cập</w:t>
       </w:r>
@@ -10287,7 +9900,7 @@
         <w:pStyle w:val="Heading1"/>
         <w:pageBreakBefore/>
       </w:pPr>
-      <w:bookmarkStart w:id="32" w:name="_Toc244297004"/>
+      <w:bookmarkStart w:id="32" w:name="_Toc244297428"/>
       <w:r>
         <w:lastRenderedPageBreak/>
         <w:t>7. TRIỂN KHAI VÀ CHỨC NĂNG HỆ THỐNG</w:t>
@@ -10298,7 +9911,7 @@
       <w:pPr>
         <w:pStyle w:val="Heading2"/>
       </w:pPr>
-      <w:bookmarkStart w:id="33" w:name="_Toc244297005"/>
+      <w:bookmarkStart w:id="33" w:name="_Toc244297429"/>
       <w:r>
         <w:t>7.1. Các module chính</w:t>
       </w:r>
@@ -10835,7 +10448,7 @@
       <w:pPr>
         <w:pStyle w:val="Heading2"/>
       </w:pPr>
-      <w:bookmarkStart w:id="35" w:name="_Toc244297006"/>
+      <w:bookmarkStart w:id="35" w:name="_Toc244297430"/>
       <w:r>
         <w:lastRenderedPageBreak/>
         <w:t>7.2. Chức năng dành cho khách</w:t>
@@ -10930,7 +10543,7 @@
       <w:pPr>
         <w:pStyle w:val="Heading2"/>
       </w:pPr>
-      <w:bookmarkStart w:id="37" w:name="_Toc244297007"/>
+      <w:bookmarkStart w:id="37" w:name="_Toc244297431"/>
       <w:r>
         <w:lastRenderedPageBreak/>
         <w:t>7.3. Chức năng dành cho quầy</w:t>
@@ -11031,7 +10644,7 @@
         <w:pStyle w:val="Heading1"/>
         <w:pageBreakBefore/>
       </w:pPr>
-      <w:bookmarkStart w:id="39" w:name="_Toc244297008"/>
+      <w:bookmarkStart w:id="39" w:name="_Toc244297432"/>
       <w:r>
         <w:lastRenderedPageBreak/>
         <w:t>8. THIẾT LẬP KIỂM THỬ VÀ THỰC NGHIỆM</w:t>
@@ -11042,7 +10655,7 @@
       <w:pPr>
         <w:pStyle w:val="Heading2"/>
       </w:pPr>
-      <w:bookmarkStart w:id="40" w:name="_Toc244297009"/>
+      <w:bookmarkStart w:id="40" w:name="_Toc244297433"/>
       <w:r>
         <w:t>8.1. Môi trường và phạm vi đánh giá</w:t>
       </w:r>
@@ -11356,7 +10969,7 @@
       <w:pPr>
         <w:pStyle w:val="Heading2"/>
       </w:pPr>
-      <w:bookmarkStart w:id="42" w:name="_Toc244297010"/>
+      <w:bookmarkStart w:id="42" w:name="_Toc244297434"/>
       <w:r>
         <w:t>8.2. Kịch bản chức năng và lỗi mạng</w:t>
       </w:r>
@@ -11377,7 +10990,7 @@
       <w:pPr>
         <w:pStyle w:val="Heading2"/>
       </w:pPr>
-      <w:bookmarkStart w:id="43" w:name="_Toc244297011"/>
+      <w:bookmarkStart w:id="43" w:name="_Toc244297435"/>
       <w:r>
         <w:t>8.3. Tải và các chỉ số sử dụng</w:t>
       </w:r>
@@ -11692,7 +11305,7 @@
         <w:pStyle w:val="Heading1"/>
         <w:pageBreakBefore/>
       </w:pPr>
-      <w:bookmarkStart w:id="45" w:name="_Toc244297012"/>
+      <w:bookmarkStart w:id="45" w:name="_Toc244297436"/>
       <w:r>
         <w:lastRenderedPageBreak/>
         <w:t>9. KẾT QUẢ KIỂM THỬ VÀ ĐÁNH GIÁ</w:t>
@@ -11703,7 +11316,7 @@
       <w:pPr>
         <w:pStyle w:val="Heading2"/>
       </w:pPr>
-      <w:bookmarkStart w:id="46" w:name="_Toc244297013"/>
+      <w:bookmarkStart w:id="46" w:name="_Toc244297437"/>
       <w:r>
         <w:t>9.1. Kết quả các chức năng chính</w:t>
       </w:r>
@@ -12181,7 +11794,7 @@
       <w:pPr>
         <w:pStyle w:val="Heading2"/>
       </w:pPr>
-      <w:bookmarkStart w:id="48" w:name="_Toc244297014"/>
+      <w:bookmarkStart w:id="48" w:name="_Toc244297438"/>
       <w:r>
         <w:lastRenderedPageBreak/>
         <w:t>9.2. Kết quả giao tiếp Client/Server</w:t>
@@ -12532,7 +12145,7 @@
       <w:pPr>
         <w:pStyle w:val="Heading2"/>
       </w:pPr>
-      <w:bookmarkStart w:id="50" w:name="_Toc244297015"/>
+      <w:bookmarkStart w:id="50" w:name="_Toc244297439"/>
       <w:r>
         <w:t>9.3. Kết quả khi tăng số khách đồng thời</w:t>
       </w:r>
@@ -13251,7 +12864,7 @@
       <w:pPr>
         <w:pStyle w:val="Heading2"/>
       </w:pPr>
-      <w:bookmarkStart w:id="53" w:name="_Toc244297016"/>
+      <w:bookmarkStart w:id="53" w:name="_Toc244297440"/>
       <w:r>
         <w:t>9.4. Kết quả so sánh phục hồi</w:t>
       </w:r>
@@ -13783,7 +13396,7 @@
       <w:pPr>
         <w:pStyle w:val="Heading1"/>
       </w:pPr>
-      <w:bookmarkStart w:id="56" w:name="_Toc244297017"/>
+      <w:bookmarkStart w:id="56" w:name="_Toc244297441"/>
       <w:r>
         <w:t>10. THẢO LUẬN</w:t>
       </w:r>
@@ -13809,7 +13422,7 @@
       <w:pPr>
         <w:pStyle w:val="Heading1"/>
       </w:pPr>
-      <w:bookmarkStart w:id="57" w:name="_Toc244297018"/>
+      <w:bookmarkStart w:id="57" w:name="_Toc244297442"/>
       <w:r>
         <w:t>11. ĐÓNG GÓP KỸ THUẬT</w:t>
       </w:r>
@@ -14051,7 +13664,7 @@
       <w:pPr>
         <w:pStyle w:val="Heading1"/>
       </w:pPr>
-      <w:bookmarkStart w:id="59" w:name="_Toc244297019"/>
+      <w:bookmarkStart w:id="59" w:name="_Toc244297443"/>
       <w:r>
         <w:lastRenderedPageBreak/>
         <w:t>12. HẠN CHẾ</w:t>
@@ -14072,7 +13685,7 @@
       <w:pPr>
         <w:pStyle w:val="Heading1"/>
       </w:pPr>
-      <w:bookmarkStart w:id="60" w:name="_Toc244297020"/>
+      <w:bookmarkStart w:id="60" w:name="_Toc244297444"/>
       <w:r>
         <w:t>13. HƯỚNG PHÁT TRIỂN</w:t>
       </w:r>
@@ -14092,7 +13705,7 @@
       <w:pPr>
         <w:pStyle w:val="Heading1"/>
       </w:pPr>
-      <w:bookmarkStart w:id="61" w:name="_Toc244297021"/>
+      <w:bookmarkStart w:id="61" w:name="_Toc244297445"/>
       <w:r>
         <w:lastRenderedPageBreak/>
         <w:t>14. KẾT LUẬN</w:t>
@@ -14121,7 +13734,7 @@
         <w:pStyle w:val="Heading1"/>
         <w:pageBreakBefore/>
       </w:pPr>
-      <w:bookmarkStart w:id="62" w:name="_Toc244297022"/>
+      <w:bookmarkStart w:id="62" w:name="_Toc244297446"/>
       <w:r>
         <w:lastRenderedPageBreak/>
         <w:t>15. TÀI LIỆU THAM KHẢO</w:t>
@@ -14484,7 +14097,7 @@
         <w:pStyle w:val="Heading1"/>
         <w:pageBreakBefore/>
       </w:pPr>
-      <w:bookmarkStart w:id="63" w:name="_Toc244297023"/>
+      <w:bookmarkStart w:id="63" w:name="_Toc244297447"/>
       <w:r>
         <w:lastRenderedPageBreak/>
         <w:t>16. PHỤ LỤC</w:t>
@@ -14495,7 +14108,7 @@
       <w:pPr>
         <w:pStyle w:val="Heading2"/>
       </w:pPr>
-      <w:bookmarkStart w:id="64" w:name="_Toc244297024"/>
+      <w:bookmarkStart w:id="64" w:name="_Toc244297448"/>
       <w:r>
         <w:t>A. Chi tiết giao thức và phục hồi</w:t>
       </w:r>
@@ -15216,7 +14829,7 @@
       <w:pPr>
         <w:pStyle w:val="Heading2"/>
       </w:pPr>
-      <w:bookmarkStart w:id="67" w:name="_Toc244297025"/>
+      <w:bookmarkStart w:id="67" w:name="_Toc244297449"/>
       <w:r>
         <w:lastRenderedPageBreak/>
         <w:t>B. Kết quả từng lượt đo ngày 30/10</w:t>
@@ -16835,7 +16448,7 @@
       <w:pPr>
         <w:pStyle w:val="Heading2"/>
       </w:pPr>
-      <w:bookmarkStart w:id="69" w:name="_Toc244297026"/>
+      <w:bookmarkStart w:id="69" w:name="_Toc244297450"/>
       <w:r>
         <w:t>C. Kết quả đối chiếu của đợt ngày 25/10</w:t>
       </w:r>

</xml_diff>